<commit_message>
docs(V11): DOKUMANTASYON/README/Word/KOD_EKI'yi V11 adil kanonige guncelle
- DOKUMANTASYON: §8.1 adil 12-strateji tablosu + §8.5/8.6 V11 multi-seed/sensitivity
  + YENI §8.9 adil-karsilastirma metodolojisi (C1-C8) + §8.10 action/nakit-faizi;
  vade gun-limiti + UI notlari; §11 keskin adil tez.
- README: V11 tez + ozellikler (nakit faizi, adil-karsilastirma, vade gun-limiti, model liste).
- RL_Final_Rapor.docx: V11 sayilari + §8.10 metodoloji/action bolumu; 10 gomulu gorsel (1.58MB).
- KOD_EKI.md: V11 kaynak (37 dosya, ~6162 satir).

191 test yesil. Repo artik tutarli: kod = dokuman = Word, hepsi V11 adil kanonik.

Co-Authored-By: Claude Opus 4.8 <noreply@anthropic.com>
</commit_message>
<xml_diff>
--- a/RL_Final_Rapor.docx
+++ b/RL_Final_Rapor.docx
@@ -688,7 +688,7 @@
                 <w:sz w:val="20"/>
                 <w:szCs w:val="20"/>
               </w:rPr>
-              <w:t xml:space="preserve">159 pytest + reprodüklenebilir golden-master (iki ardışık koşu 0.0 fark) + 5-seed çoklu-tohum + ödül duyarlılık + walk-forward + DSR/PBO + Monte-Carlo</w:t>
+              <w:t xml:space="preserve">191 pytest + reprodüklenebilir golden V11 (≤1e-6) + adil-karşılaştırma (re-base/maliyetli baseline) + 5-seed çoklu-tohum + ödül duyarlılık + walk-forward + DSR/PBO + Monte-Carlo</w:t>
             </w:r>
           </w:p>
         </w:tc>
@@ -1816,7 +1816,7 @@
                 <w:sz w:val="20"/>
                 <w:szCs w:val="20"/>
               </w:rPr>
-              <w:t xml:space="preserve">Zaman kısıtı</w:t>
+              <w:t xml:space="preserve">Zaman kısıtı (vade)</w:t>
             </w:r>
           </w:p>
         </w:tc>
@@ -1845,7 +1845,7 @@
                 <w:sz w:val="20"/>
                 <w:szCs w:val="20"/>
               </w:rPr>
-              <w:t xml:space="preserve">Episode en fazla max_steps (252 ≈ 1 iş yılı) sürer. Amaç: sonlu, karşılaştırılabilir bölümler</w:t>
+              <w:t xml:space="preserve">Eğitim episode'u vade train_max_steps kadar sürer (Kısa 30 / Orta 90 / Uzun 360 gün); değerlendirme TAM test dönemini koşar. Amaç: vade stratejisi + adil backtest</w:t>
             </w:r>
           </w:p>
         </w:tc>
@@ -2034,7 +2034,7 @@
           <w:sz w:val="18"/>
           <w:szCs w:val="18"/>
         </w:rPr>
-        <w:t xml:space="preserve">    log(1 + w_t . r_{t+1})        &lt;- risk-getiri (log buyume)</w:t>
+        <w:t xml:space="preserve">    log(1 + w_t . r_{t+1} - eta_t*||Delta w_t||_1)  &lt;- NET log-getiri (V11/C7: maliyet log icinde)</w:t>
       </w:r>
     </w:p>
     <w:p>
@@ -2048,7 +2048,7 @@
           <w:sz w:val="18"/>
           <w:szCs w:val="18"/>
         </w:rPr>
-        <w:t xml:space="preserve">    - eta_t * ||Delta w_t||_1      &lt;- islem maliyeti</w:t>
+        <w:t xml:space="preserve">    (nakit agirligi gunluk risksiz faiz r_rf kazanir; r_{t+1} nakit dahil)</w:t>
       </w:r>
     </w:p>
     <w:p>
@@ -3358,7 +3358,7 @@
                 <w:sz w:val="20"/>
                 <w:szCs w:val="20"/>
               </w:rPr>
-              <w:t xml:space="preserve">Log-büyüme log(1+gross_port_r)</w:t>
+              <w:t xml:space="preserve">Log-büyüme log(1+net_port_r) [V11/C7]</w:t>
             </w:r>
           </w:p>
         </w:tc>
@@ -3386,7 +3386,7 @@
                 <w:sz w:val="20"/>
                 <w:szCs w:val="20"/>
               </w:rPr>
-              <w:t xml:space="preserve">+ ana getiri sinyali (geometrik büyüme)</w:t>
+              <w:t xml:space="preserve">+ ana getiri (geometrik); işlem maliyeti log içinde (net) → çift-sayım yok</w:t>
             </w:r>
           </w:p>
         </w:tc>
@@ -8329,7 +8329,7 @@
         <w:pStyle w:val="Heading2"/>
       </w:pPr>
       <w:r>
-        <w:t xml:space="preserve">8.1. Test dönemi performansı (2022–2024, reprodüklenebilir kanonik, seed=42)</w:t>
+        <w:t xml:space="preserve">8.1. Test dönemi performansı (2022–2024, ADİL kanonik V11; seed=42)</w:t>
       </w:r>
     </w:p>
     <w:p>
@@ -8343,7 +8343,7 @@
           <w:iCs/>
           <w:color w:val="555555"/>
         </w:rPr>
-        <w:t xml:space="preserve">Reprodüklenebilirlik: bu satırlar python main.py (seed=42) çıktısıdır; iki ardışık koşu arasında maksimum fark 0.0 (golden-master ile kilitli). Eski V8 anlık görüntüsü bu makinede reprodüklenemiyordu — geçerli kanonik budur.</w:t>
+        <w:t xml:space="preserve">Adalet + reprodüklenebilirlik (V11): re-base hizalama (tüm stratejiler NAV[0]=1, AYNI pencere) + simetrik işlem maliyeti (η≈10bps RL+baseline) + nakit %40 yıllık faiz. python main.py (seed=42) iki ardışık koşu ≤1e-6 (golden V11 kilitli). Önceki asimetrik karşılaştırma (RL maliyet öder/baseline ödemez, RL nakiti %0) düzeltildi → RL daha rekabetçi.</w:t>
       </w:r>
     </w:p>
     <w:tbl>
@@ -8359,13 +8359,13 @@
         </w:tblBorders>
       </w:tblPr>
       <w:tblGrid>
-        <w:gridCol w:w="1560"/>
-        <w:gridCol w:w="1140"/>
-        <w:gridCol w:w="1140"/>
-        <w:gridCol w:w="1140"/>
+        <w:gridCol w:w="1500"/>
         <w:gridCol w:w="1080"/>
         <w:gridCol w:w="1080"/>
-        <w:gridCol w:w="1140"/>
+        <w:gridCol w:w="1080"/>
+        <w:gridCol w:w="1080"/>
+        <w:gridCol w:w="1080"/>
+        <w:gridCol w:w="1200"/>
         <w:gridCol w:w="1080"/>
       </w:tblGrid>
       <w:tr>
@@ -8374,7 +8374,7 @@
         </w:trPr>
         <w:tc>
           <w:tcPr>
-            <w:tcW w:type="dxa" w:w="1560"/>
+            <w:tcW w:type="dxa" w:w="1500"/>
             <w:tcBorders>
               <w:top w:val="single" w:color="BFBFBF" w:sz="1"/>
               <w:left w:val="single" w:color="BFBFBF" w:sz="1"/>
@@ -8403,7 +8403,7 @@
         </w:tc>
         <w:tc>
           <w:tcPr>
-            <w:tcW w:type="dxa" w:w="1140"/>
+            <w:tcW w:type="dxa" w:w="1080"/>
             <w:tcBorders>
               <w:top w:val="single" w:color="BFBFBF" w:sz="1"/>
               <w:left w:val="single" w:color="BFBFBF" w:sz="1"/>
@@ -8432,7 +8432,7 @@
         </w:tc>
         <w:tc>
           <w:tcPr>
-            <w:tcW w:type="dxa" w:w="1140"/>
+            <w:tcW w:type="dxa" w:w="1080"/>
             <w:tcBorders>
               <w:top w:val="single" w:color="BFBFBF" w:sz="1"/>
               <w:left w:val="single" w:color="BFBFBF" w:sz="1"/>
@@ -8461,7 +8461,7 @@
         </w:tc>
         <w:tc>
           <w:tcPr>
-            <w:tcW w:type="dxa" w:w="1140"/>
+            <w:tcW w:type="dxa" w:w="1080"/>
             <w:tcBorders>
               <w:top w:val="single" w:color="BFBFBF" w:sz="1"/>
               <w:left w:val="single" w:color="BFBFBF" w:sz="1"/>
@@ -8548,7 +8548,7 @@
         </w:tc>
         <w:tc>
           <w:tcPr>
-            <w:tcW w:type="dxa" w:w="1140"/>
+            <w:tcW w:type="dxa" w:w="1200"/>
             <w:tcBorders>
               <w:top w:val="single" w:color="BFBFBF" w:sz="1"/>
               <w:left w:val="single" w:color="BFBFBF" w:sz="1"/>
@@ -8608,7 +8608,7 @@
       <w:tr>
         <w:tc>
           <w:tcPr>
-            <w:tcW w:type="dxa" w:w="1560"/>
+            <w:tcW w:type="dxa" w:w="1500"/>
             <w:tcBorders>
               <w:top w:val="single" w:color="BFBFBF" w:sz="1"/>
               <w:left w:val="single" w:color="BFBFBF" w:sz="1"/>
@@ -8636,90 +8636,6 @@
         </w:tc>
         <w:tc>
           <w:tcPr>
-            <w:tcW w:type="dxa" w:w="1140"/>
-            <w:tcBorders>
-              <w:top w:val="single" w:color="BFBFBF" w:sz="1"/>
-              <w:left w:val="single" w:color="BFBFBF" w:sz="1"/>
-              <w:bottom w:val="single" w:color="BFBFBF" w:sz="1"/>
-              <w:right w:val="single" w:color="BFBFBF" w:sz="1"/>
-            </w:tcBorders>
-            <w:tcMar>
-              <w:top w:type="dxa" w:w="60"/>
-              <w:left w:type="dxa" w:w="110"/>
-              <w:bottom w:type="dxa" w:w="60"/>
-              <w:right w:type="dxa" w:w="110"/>
-            </w:tcMar>
-          </w:tcPr>
-          <w:p>
-            <w:r>
-              <w:rPr>
-                <w:b w:val="false"/>
-                <w:bCs w:val="false"/>
-                <w:sz w:val="20"/>
-                <w:szCs w:val="20"/>
-              </w:rPr>
-              <w:t xml:space="preserve">+0.094</w:t>
-            </w:r>
-          </w:p>
-        </w:tc>
-        <w:tc>
-          <w:tcPr>
-            <w:tcW w:type="dxa" w:w="1140"/>
-            <w:tcBorders>
-              <w:top w:val="single" w:color="BFBFBF" w:sz="1"/>
-              <w:left w:val="single" w:color="BFBFBF" w:sz="1"/>
-              <w:bottom w:val="single" w:color="BFBFBF" w:sz="1"/>
-              <w:right w:val="single" w:color="BFBFBF" w:sz="1"/>
-            </w:tcBorders>
-            <w:tcMar>
-              <w:top w:type="dxa" w:w="60"/>
-              <w:left w:type="dxa" w:w="110"/>
-              <w:bottom w:type="dxa" w:w="60"/>
-              <w:right w:type="dxa" w:w="110"/>
-            </w:tcMar>
-          </w:tcPr>
-          <w:p>
-            <w:r>
-              <w:rPr>
-                <w:b w:val="false"/>
-                <w:bCs w:val="false"/>
-                <w:sz w:val="20"/>
-                <w:szCs w:val="20"/>
-              </w:rPr>
-              <w:t xml:space="preserve">+0.435</w:t>
-            </w:r>
-          </w:p>
-        </w:tc>
-        <w:tc>
-          <w:tcPr>
-            <w:tcW w:type="dxa" w:w="1140"/>
-            <w:tcBorders>
-              <w:top w:val="single" w:color="BFBFBF" w:sz="1"/>
-              <w:left w:val="single" w:color="BFBFBF" w:sz="1"/>
-              <w:bottom w:val="single" w:color="BFBFBF" w:sz="1"/>
-              <w:right w:val="single" w:color="BFBFBF" w:sz="1"/>
-            </w:tcBorders>
-            <w:tcMar>
-              <w:top w:type="dxa" w:w="60"/>
-              <w:left w:type="dxa" w:w="110"/>
-              <w:bottom w:type="dxa" w:w="60"/>
-              <w:right w:type="dxa" w:w="110"/>
-            </w:tcMar>
-          </w:tcPr>
-          <w:p>
-            <w:r>
-              <w:rPr>
-                <w:b w:val="false"/>
-                <w:bCs w:val="false"/>
-                <w:sz w:val="20"/>
-                <w:szCs w:val="20"/>
-              </w:rPr>
-              <w:t xml:space="preserve">—</w:t>
-            </w:r>
-          </w:p>
-        </w:tc>
-        <w:tc>
-          <w:tcPr>
             <w:tcW w:type="dxa" w:w="1080"/>
             <w:tcBorders>
               <w:top w:val="single" w:color="BFBFBF" w:sz="1"/>
@@ -8742,7 +8658,7 @@
                 <w:sz w:val="20"/>
                 <w:szCs w:val="20"/>
               </w:rPr>
-              <w:t xml:space="preserve">−0.363</w:t>
+              <w:t xml:space="preserve">+0.115</w:t>
             </w:r>
           </w:p>
         </w:tc>
@@ -8770,35 +8686,7 @@
                 <w:sz w:val="20"/>
                 <w:szCs w:val="20"/>
               </w:rPr>
-              <w:t xml:space="preserve">+0.259</w:t>
-            </w:r>
-          </w:p>
-        </w:tc>
-        <w:tc>
-          <w:tcPr>
-            <w:tcW w:type="dxa" w:w="1140"/>
-            <w:tcBorders>
-              <w:top w:val="single" w:color="BFBFBF" w:sz="1"/>
-              <w:left w:val="single" w:color="BFBFBF" w:sz="1"/>
-              <w:bottom w:val="single" w:color="BFBFBF" w:sz="1"/>
-              <w:right w:val="single" w:color="BFBFBF" w:sz="1"/>
-            </w:tcBorders>
-            <w:tcMar>
-              <w:top w:type="dxa" w:w="60"/>
-              <w:left w:type="dxa" w:w="110"/>
-              <w:bottom w:type="dxa" w:w="60"/>
-              <w:right w:type="dxa" w:w="110"/>
-            </w:tcMar>
-          </w:tcPr>
-          <w:p>
-            <w:r>
-              <w:rPr>
-                <w:b w:val="false"/>
-                <w:bCs w:val="false"/>
-                <w:sz w:val="20"/>
-                <w:szCs w:val="20"/>
-              </w:rPr>
-              <w:t xml:space="preserve">1.279</w:t>
+              <w:t xml:space="preserve">+0.484</w:t>
             </w:r>
           </w:p>
         </w:tc>
@@ -8826,7 +8714,119 @@
                 <w:sz w:val="20"/>
                 <w:szCs w:val="20"/>
               </w:rPr>
-              <w:t xml:space="preserve">0.238</w:t>
+              <w:t xml:space="preserve">+0.721</w:t>
+            </w:r>
+          </w:p>
+        </w:tc>
+        <w:tc>
+          <w:tcPr>
+            <w:tcW w:type="dxa" w:w="1080"/>
+            <w:tcBorders>
+              <w:top w:val="single" w:color="BFBFBF" w:sz="1"/>
+              <w:left w:val="single" w:color="BFBFBF" w:sz="1"/>
+              <w:bottom w:val="single" w:color="BFBFBF" w:sz="1"/>
+              <w:right w:val="single" w:color="BFBFBF" w:sz="1"/>
+            </w:tcBorders>
+            <w:tcMar>
+              <w:top w:type="dxa" w:w="60"/>
+              <w:left w:type="dxa" w:w="110"/>
+              <w:bottom w:type="dxa" w:w="60"/>
+              <w:right w:type="dxa" w:w="110"/>
+            </w:tcMar>
+          </w:tcPr>
+          <w:p>
+            <w:r>
+              <w:rPr>
+                <w:b w:val="false"/>
+                <w:bCs w:val="false"/>
+                <w:sz w:val="20"/>
+                <w:szCs w:val="20"/>
+              </w:rPr>
+              <w:t xml:space="preserve">−0.452</w:t>
+            </w:r>
+          </w:p>
+        </w:tc>
+        <w:tc>
+          <w:tcPr>
+            <w:tcW w:type="dxa" w:w="1080"/>
+            <w:tcBorders>
+              <w:top w:val="single" w:color="BFBFBF" w:sz="1"/>
+              <w:left w:val="single" w:color="BFBFBF" w:sz="1"/>
+              <w:bottom w:val="single" w:color="BFBFBF" w:sz="1"/>
+              <w:right w:val="single" w:color="BFBFBF" w:sz="1"/>
+            </w:tcBorders>
+            <w:tcMar>
+              <w:top w:type="dxa" w:w="60"/>
+              <w:left w:type="dxa" w:w="110"/>
+              <w:bottom w:type="dxa" w:w="60"/>
+              <w:right w:type="dxa" w:w="110"/>
+            </w:tcMar>
+          </w:tcPr>
+          <w:p>
+            <w:r>
+              <w:rPr>
+                <w:b w:val="false"/>
+                <w:bCs w:val="false"/>
+                <w:sz w:val="20"/>
+                <w:szCs w:val="20"/>
+              </w:rPr>
+              <w:t xml:space="preserve">+0.255</w:t>
+            </w:r>
+          </w:p>
+        </w:tc>
+        <w:tc>
+          <w:tcPr>
+            <w:tcW w:type="dxa" w:w="1200"/>
+            <w:tcBorders>
+              <w:top w:val="single" w:color="BFBFBF" w:sz="1"/>
+              <w:left w:val="single" w:color="BFBFBF" w:sz="1"/>
+              <w:bottom w:val="single" w:color="BFBFBF" w:sz="1"/>
+              <w:right w:val="single" w:color="BFBFBF" w:sz="1"/>
+            </w:tcBorders>
+            <w:tcMar>
+              <w:top w:type="dxa" w:w="60"/>
+              <w:left w:type="dxa" w:w="110"/>
+              <w:bottom w:type="dxa" w:w="60"/>
+              <w:right w:type="dxa" w:w="110"/>
+            </w:tcMar>
+          </w:tcPr>
+          <w:p>
+            <w:r>
+              <w:rPr>
+                <w:b w:val="false"/>
+                <w:bCs w:val="false"/>
+                <w:sz w:val="20"/>
+                <w:szCs w:val="20"/>
+              </w:rPr>
+              <w:t xml:space="preserve">1.348</w:t>
+            </w:r>
+          </w:p>
+        </w:tc>
+        <w:tc>
+          <w:tcPr>
+            <w:tcW w:type="dxa" w:w="1080"/>
+            <w:tcBorders>
+              <w:top w:val="single" w:color="BFBFBF" w:sz="1"/>
+              <w:left w:val="single" w:color="BFBFBF" w:sz="1"/>
+              <w:bottom w:val="single" w:color="BFBFBF" w:sz="1"/>
+              <w:right w:val="single" w:color="BFBFBF" w:sz="1"/>
+            </w:tcBorders>
+            <w:tcMar>
+              <w:top w:type="dxa" w:w="60"/>
+              <w:left w:type="dxa" w:w="110"/>
+              <w:bottom w:type="dxa" w:w="60"/>
+              <w:right w:type="dxa" w:w="110"/>
+            </w:tcMar>
+          </w:tcPr>
+          <w:p>
+            <w:r>
+              <w:rPr>
+                <w:b w:val="false"/>
+                <w:bCs w:val="false"/>
+                <w:sz w:val="20"/>
+                <w:szCs w:val="20"/>
+              </w:rPr>
+              <w:t xml:space="preserve">0.235</w:t>
             </w:r>
           </w:p>
         </w:tc>
@@ -8834,7 +8834,7 @@
       <w:tr>
         <w:tc>
           <w:tcPr>
-            <w:tcW w:type="dxa" w:w="1560"/>
+            <w:tcW w:type="dxa" w:w="1500"/>
             <w:tcBorders>
               <w:top w:val="single" w:color="BFBFBF" w:sz="1"/>
               <w:left w:val="single" w:color="BFBFBF" w:sz="1"/>
@@ -8863,93 +8863,6 @@
         </w:tc>
         <w:tc>
           <w:tcPr>
-            <w:tcW w:type="dxa" w:w="1140"/>
-            <w:tcBorders>
-              <w:top w:val="single" w:color="BFBFBF" w:sz="1"/>
-              <w:left w:val="single" w:color="BFBFBF" w:sz="1"/>
-              <w:bottom w:val="single" w:color="BFBFBF" w:sz="1"/>
-              <w:right w:val="single" w:color="BFBFBF" w:sz="1"/>
-            </w:tcBorders>
-            <w:shd w:fill="F3F6FB" w:val="clear"/>
-            <w:tcMar>
-              <w:top w:type="dxa" w:w="60"/>
-              <w:left w:type="dxa" w:w="110"/>
-              <w:bottom w:type="dxa" w:w="60"/>
-              <w:right w:type="dxa" w:w="110"/>
-            </w:tcMar>
-          </w:tcPr>
-          <w:p>
-            <w:r>
-              <w:rPr>
-                <w:b w:val="false"/>
-                <w:bCs w:val="false"/>
-                <w:sz w:val="20"/>
-                <w:szCs w:val="20"/>
-              </w:rPr>
-              <w:t xml:space="preserve">+0.646</w:t>
-            </w:r>
-          </w:p>
-        </w:tc>
-        <w:tc>
-          <w:tcPr>
-            <w:tcW w:type="dxa" w:w="1140"/>
-            <w:tcBorders>
-              <w:top w:val="single" w:color="BFBFBF" w:sz="1"/>
-              <w:left w:val="single" w:color="BFBFBF" w:sz="1"/>
-              <w:bottom w:val="single" w:color="BFBFBF" w:sz="1"/>
-              <w:right w:val="single" w:color="BFBFBF" w:sz="1"/>
-            </w:tcBorders>
-            <w:shd w:fill="F3F6FB" w:val="clear"/>
-            <w:tcMar>
-              <w:top w:type="dxa" w:w="60"/>
-              <w:left w:type="dxa" w:w="110"/>
-              <w:bottom w:type="dxa" w:w="60"/>
-              <w:right w:type="dxa" w:w="110"/>
-            </w:tcMar>
-          </w:tcPr>
-          <w:p>
-            <w:r>
-              <w:rPr>
-                <w:b w:val="false"/>
-                <w:bCs w:val="false"/>
-                <w:sz w:val="20"/>
-                <w:szCs w:val="20"/>
-              </w:rPr>
-              <w:t xml:space="preserve">+1.692</w:t>
-            </w:r>
-          </w:p>
-        </w:tc>
-        <w:tc>
-          <w:tcPr>
-            <w:tcW w:type="dxa" w:w="1140"/>
-            <w:tcBorders>
-              <w:top w:val="single" w:color="BFBFBF" w:sz="1"/>
-              <w:left w:val="single" w:color="BFBFBF" w:sz="1"/>
-              <w:bottom w:val="single" w:color="BFBFBF" w:sz="1"/>
-              <w:right w:val="single" w:color="BFBFBF" w:sz="1"/>
-            </w:tcBorders>
-            <w:shd w:fill="F3F6FB" w:val="clear"/>
-            <w:tcMar>
-              <w:top w:type="dxa" w:w="60"/>
-              <w:left w:type="dxa" w:w="110"/>
-              <w:bottom w:type="dxa" w:w="60"/>
-              <w:right w:type="dxa" w:w="110"/>
-            </w:tcMar>
-          </w:tcPr>
-          <w:p>
-            <w:r>
-              <w:rPr>
-                <w:b w:val="false"/>
-                <w:bCs w:val="false"/>
-                <w:sz w:val="20"/>
-                <w:szCs w:val="20"/>
-              </w:rPr>
-              <w:t xml:space="preserve">+2.717</w:t>
-            </w:r>
-          </w:p>
-        </w:tc>
-        <w:tc>
-          <w:tcPr>
             <w:tcW w:type="dxa" w:w="1080"/>
             <w:tcBorders>
               <w:top w:val="single" w:color="BFBFBF" w:sz="1"/>
@@ -8973,7 +8886,7 @@
                 <w:sz w:val="20"/>
                 <w:szCs w:val="20"/>
               </w:rPr>
-              <w:t xml:space="preserve">−0.266</w:t>
+              <w:t xml:space="preserve">+0.794</w:t>
             </w:r>
           </w:p>
         </w:tc>
@@ -9002,36 +8915,7 @@
                 <w:sz w:val="20"/>
                 <w:szCs w:val="20"/>
               </w:rPr>
-              <w:t xml:space="preserve">+2.428</w:t>
-            </w:r>
-          </w:p>
-        </w:tc>
-        <w:tc>
-          <w:tcPr>
-            <w:tcW w:type="dxa" w:w="1140"/>
-            <w:tcBorders>
-              <w:top w:val="single" w:color="BFBFBF" w:sz="1"/>
-              <w:left w:val="single" w:color="BFBFBF" w:sz="1"/>
-              <w:bottom w:val="single" w:color="BFBFBF" w:sz="1"/>
-              <w:right w:val="single" w:color="BFBFBF" w:sz="1"/>
-            </w:tcBorders>
-            <w:shd w:fill="F3F6FB" w:val="clear"/>
-            <w:tcMar>
-              <w:top w:type="dxa" w:w="60"/>
-              <w:left w:type="dxa" w:w="110"/>
-              <w:bottom w:type="dxa" w:w="60"/>
-              <w:right w:type="dxa" w:w="110"/>
-            </w:tcMar>
-          </w:tcPr>
-          <w:p>
-            <w:r>
-              <w:rPr>
-                <w:b w:val="false"/>
-                <w:bCs w:val="false"/>
-                <w:sz w:val="20"/>
-                <w:szCs w:val="20"/>
-              </w:rPr>
-              <w:t xml:space="preserve">3.907</w:t>
+              <w:t xml:space="preserve">+2.010</w:t>
             </w:r>
           </w:p>
         </w:tc>
@@ -9060,7 +8944,123 @@
                 <w:sz w:val="20"/>
                 <w:szCs w:val="20"/>
               </w:rPr>
-              <w:t xml:space="preserve">0.139</w:t>
+              <w:t xml:space="preserve">+3.242</w:t>
+            </w:r>
+          </w:p>
+        </w:tc>
+        <w:tc>
+          <w:tcPr>
+            <w:tcW w:type="dxa" w:w="1080"/>
+            <w:tcBorders>
+              <w:top w:val="single" w:color="BFBFBF" w:sz="1"/>
+              <w:left w:val="single" w:color="BFBFBF" w:sz="1"/>
+              <w:bottom w:val="single" w:color="BFBFBF" w:sz="1"/>
+              <w:right w:val="single" w:color="BFBFBF" w:sz="1"/>
+            </w:tcBorders>
+            <w:shd w:fill="F3F6FB" w:val="clear"/>
+            <w:tcMar>
+              <w:top w:type="dxa" w:w="60"/>
+              <w:left w:type="dxa" w:w="110"/>
+              <w:bottom w:type="dxa" w:w="60"/>
+              <w:right w:type="dxa" w:w="110"/>
+            </w:tcMar>
+          </w:tcPr>
+          <w:p>
+            <w:r>
+              <w:rPr>
+                <w:b w:val="false"/>
+                <w:bCs w:val="false"/>
+                <w:sz w:val="20"/>
+                <w:szCs w:val="20"/>
+              </w:rPr>
+              <w:t xml:space="preserve">−0.258</w:t>
+            </w:r>
+          </w:p>
+        </w:tc>
+        <w:tc>
+          <w:tcPr>
+            <w:tcW w:type="dxa" w:w="1080"/>
+            <w:tcBorders>
+              <w:top w:val="single" w:color="BFBFBF" w:sz="1"/>
+              <w:left w:val="single" w:color="BFBFBF" w:sz="1"/>
+              <w:bottom w:val="single" w:color="BFBFBF" w:sz="1"/>
+              <w:right w:val="single" w:color="BFBFBF" w:sz="1"/>
+            </w:tcBorders>
+            <w:shd w:fill="F3F6FB" w:val="clear"/>
+            <w:tcMar>
+              <w:top w:type="dxa" w:w="60"/>
+              <w:left w:type="dxa" w:w="110"/>
+              <w:bottom w:type="dxa" w:w="60"/>
+              <w:right w:type="dxa" w:w="110"/>
+            </w:tcMar>
+          </w:tcPr>
+          <w:p>
+            <w:r>
+              <w:rPr>
+                <w:b w:val="false"/>
+                <w:bCs w:val="false"/>
+                <w:sz w:val="20"/>
+                <w:szCs w:val="20"/>
+              </w:rPr>
+              <w:t xml:space="preserve">+3.075</w:t>
+            </w:r>
+          </w:p>
+        </w:tc>
+        <w:tc>
+          <w:tcPr>
+            <w:tcW w:type="dxa" w:w="1200"/>
+            <w:tcBorders>
+              <w:top w:val="single" w:color="BFBFBF" w:sz="1"/>
+              <w:left w:val="single" w:color="BFBFBF" w:sz="1"/>
+              <w:bottom w:val="single" w:color="BFBFBF" w:sz="1"/>
+              <w:right w:val="single" w:color="BFBFBF" w:sz="1"/>
+            </w:tcBorders>
+            <w:shd w:fill="F3F6FB" w:val="clear"/>
+            <w:tcMar>
+              <w:top w:type="dxa" w:w="60"/>
+              <w:left w:type="dxa" w:w="110"/>
+              <w:bottom w:type="dxa" w:w="60"/>
+              <w:right w:type="dxa" w:w="110"/>
+            </w:tcMar>
+          </w:tcPr>
+          <w:p>
+            <w:r>
+              <w:rPr>
+                <w:b w:val="false"/>
+                <w:bCs w:val="false"/>
+                <w:sz w:val="20"/>
+                <w:szCs w:val="20"/>
+              </w:rPr>
+              <w:t xml:space="preserve">4.946</w:t>
+            </w:r>
+          </w:p>
+        </w:tc>
+        <w:tc>
+          <w:tcPr>
+            <w:tcW w:type="dxa" w:w="1080"/>
+            <w:tcBorders>
+              <w:top w:val="single" w:color="BFBFBF" w:sz="1"/>
+              <w:left w:val="single" w:color="BFBFBF" w:sz="1"/>
+              <w:bottom w:val="single" w:color="BFBFBF" w:sz="1"/>
+              <w:right w:val="single" w:color="BFBFBF" w:sz="1"/>
+            </w:tcBorders>
+            <w:shd w:fill="F3F6FB" w:val="clear"/>
+            <w:tcMar>
+              <w:top w:type="dxa" w:w="60"/>
+              <w:left w:type="dxa" w:w="110"/>
+              <w:bottom w:type="dxa" w:w="60"/>
+              <w:right w:type="dxa" w:w="110"/>
+            </w:tcMar>
+          </w:tcPr>
+          <w:p>
+            <w:r>
+              <w:rPr>
+                <w:b w:val="false"/>
+                <w:bCs w:val="false"/>
+                <w:sz w:val="20"/>
+                <w:szCs w:val="20"/>
+              </w:rPr>
+              <w:t xml:space="preserve">0.049</w:t>
             </w:r>
           </w:p>
         </w:tc>
@@ -9068,7 +9068,7 @@
       <w:tr>
         <w:tc>
           <w:tcPr>
-            <w:tcW w:type="dxa" w:w="1560"/>
+            <w:tcW w:type="dxa" w:w="1500"/>
             <w:tcBorders>
               <w:top w:val="single" w:color="BFBFBF" w:sz="1"/>
               <w:left w:val="single" w:color="BFBFBF" w:sz="1"/>
@@ -9096,90 +9096,6 @@
         </w:tc>
         <w:tc>
           <w:tcPr>
-            <w:tcW w:type="dxa" w:w="1140"/>
-            <w:tcBorders>
-              <w:top w:val="single" w:color="BFBFBF" w:sz="1"/>
-              <w:left w:val="single" w:color="BFBFBF" w:sz="1"/>
-              <w:bottom w:val="single" w:color="BFBFBF" w:sz="1"/>
-              <w:right w:val="single" w:color="BFBFBF" w:sz="1"/>
-            </w:tcBorders>
-            <w:tcMar>
-              <w:top w:type="dxa" w:w="60"/>
-              <w:left w:type="dxa" w:w="110"/>
-              <w:bottom w:type="dxa" w:w="60"/>
-              <w:right w:type="dxa" w:w="110"/>
-            </w:tcMar>
-          </w:tcPr>
-          <w:p>
-            <w:r>
-              <w:rPr>
-                <w:b w:val="false"/>
-                <w:bCs w:val="false"/>
-                <w:sz w:val="20"/>
-                <w:szCs w:val="20"/>
-              </w:rPr>
-              <w:t xml:space="preserve">+0.866</w:t>
-            </w:r>
-          </w:p>
-        </w:tc>
-        <w:tc>
-          <w:tcPr>
-            <w:tcW w:type="dxa" w:w="1140"/>
-            <w:tcBorders>
-              <w:top w:val="single" w:color="BFBFBF" w:sz="1"/>
-              <w:left w:val="single" w:color="BFBFBF" w:sz="1"/>
-              <w:bottom w:val="single" w:color="BFBFBF" w:sz="1"/>
-              <w:right w:val="single" w:color="BFBFBF" w:sz="1"/>
-            </w:tcBorders>
-            <w:tcMar>
-              <w:top w:type="dxa" w:w="60"/>
-              <w:left w:type="dxa" w:w="110"/>
-              <w:bottom w:type="dxa" w:w="60"/>
-              <w:right w:type="dxa" w:w="110"/>
-            </w:tcMar>
-          </w:tcPr>
-          <w:p>
-            <w:r>
-              <w:rPr>
-                <w:b w:val="false"/>
-                <w:bCs w:val="false"/>
-                <w:sz w:val="20"/>
-                <w:szCs w:val="20"/>
-              </w:rPr>
-              <w:t xml:space="preserve">+2.102</w:t>
-            </w:r>
-          </w:p>
-        </w:tc>
-        <w:tc>
-          <w:tcPr>
-            <w:tcW w:type="dxa" w:w="1140"/>
-            <w:tcBorders>
-              <w:top w:val="single" w:color="BFBFBF" w:sz="1"/>
-              <w:left w:val="single" w:color="BFBFBF" w:sz="1"/>
-              <w:bottom w:val="single" w:color="BFBFBF" w:sz="1"/>
-              <w:right w:val="single" w:color="BFBFBF" w:sz="1"/>
-            </w:tcBorders>
-            <w:tcMar>
-              <w:top w:type="dxa" w:w="60"/>
-              <w:left w:type="dxa" w:w="110"/>
-              <w:bottom w:type="dxa" w:w="60"/>
-              <w:right w:type="dxa" w:w="110"/>
-            </w:tcMar>
-          </w:tcPr>
-          <w:p>
-            <w:r>
-              <w:rPr>
-                <w:b w:val="false"/>
-                <w:bCs w:val="false"/>
-                <w:sz w:val="20"/>
-                <w:szCs w:val="20"/>
-              </w:rPr>
-              <w:t xml:space="preserve">+3.413</w:t>
-            </w:r>
-          </w:p>
-        </w:tc>
-        <w:tc>
-          <w:tcPr>
             <w:tcW w:type="dxa" w:w="1080"/>
             <w:tcBorders>
               <w:top w:val="single" w:color="BFBFBF" w:sz="1"/>
@@ -9202,6 +9118,90 @@
                 <w:sz w:val="20"/>
                 <w:szCs w:val="20"/>
               </w:rPr>
+              <w:t xml:space="preserve">+0.877</w:t>
+            </w:r>
+          </w:p>
+        </w:tc>
+        <w:tc>
+          <w:tcPr>
+            <w:tcW w:type="dxa" w:w="1080"/>
+            <w:tcBorders>
+              <w:top w:val="single" w:color="BFBFBF" w:sz="1"/>
+              <w:left w:val="single" w:color="BFBFBF" w:sz="1"/>
+              <w:bottom w:val="single" w:color="BFBFBF" w:sz="1"/>
+              <w:right w:val="single" w:color="BFBFBF" w:sz="1"/>
+            </w:tcBorders>
+            <w:tcMar>
+              <w:top w:type="dxa" w:w="60"/>
+              <w:left w:type="dxa" w:w="110"/>
+              <w:bottom w:type="dxa" w:w="60"/>
+              <w:right w:type="dxa" w:w="110"/>
+            </w:tcMar>
+          </w:tcPr>
+          <w:p>
+            <w:r>
+              <w:rPr>
+                <w:b w:val="false"/>
+                <w:bCs w:val="false"/>
+                <w:sz w:val="20"/>
+                <w:szCs w:val="20"/>
+              </w:rPr>
+              <w:t xml:space="preserve">+2.141</w:t>
+            </w:r>
+          </w:p>
+        </w:tc>
+        <w:tc>
+          <w:tcPr>
+            <w:tcW w:type="dxa" w:w="1080"/>
+            <w:tcBorders>
+              <w:top w:val="single" w:color="BFBFBF" w:sz="1"/>
+              <w:left w:val="single" w:color="BFBFBF" w:sz="1"/>
+              <w:bottom w:val="single" w:color="BFBFBF" w:sz="1"/>
+              <w:right w:val="single" w:color="BFBFBF" w:sz="1"/>
+            </w:tcBorders>
+            <w:tcMar>
+              <w:top w:type="dxa" w:w="60"/>
+              <w:left w:type="dxa" w:w="110"/>
+              <w:bottom w:type="dxa" w:w="60"/>
+              <w:right w:type="dxa" w:w="110"/>
+            </w:tcMar>
+          </w:tcPr>
+          <w:p>
+            <w:r>
+              <w:rPr>
+                <w:b w:val="false"/>
+                <w:bCs w:val="false"/>
+                <w:sz w:val="20"/>
+                <w:szCs w:val="20"/>
+              </w:rPr>
+              <w:t xml:space="preserve">+3.484</w:t>
+            </w:r>
+          </w:p>
+        </w:tc>
+        <w:tc>
+          <w:tcPr>
+            <w:tcW w:type="dxa" w:w="1080"/>
+            <w:tcBorders>
+              <w:top w:val="single" w:color="BFBFBF" w:sz="1"/>
+              <w:left w:val="single" w:color="BFBFBF" w:sz="1"/>
+              <w:bottom w:val="single" w:color="BFBFBF" w:sz="1"/>
+              <w:right w:val="single" w:color="BFBFBF" w:sz="1"/>
+            </w:tcBorders>
+            <w:tcMar>
+              <w:top w:type="dxa" w:w="60"/>
+              <w:left w:type="dxa" w:w="110"/>
+              <w:bottom w:type="dxa" w:w="60"/>
+              <w:right w:type="dxa" w:w="110"/>
+            </w:tcMar>
+          </w:tcPr>
+          <w:p>
+            <w:r>
+              <w:rPr>
+                <w:b w:val="false"/>
+                <w:bCs w:val="false"/>
+                <w:sz w:val="20"/>
+                <w:szCs w:val="20"/>
+              </w:rPr>
               <w:t xml:space="preserve">−0.254</w:t>
             </w:r>
           </w:p>
@@ -9230,35 +9230,35 @@
                 <w:sz w:val="20"/>
                 <w:szCs w:val="20"/>
               </w:rPr>
-              <w:t xml:space="preserve">+3.404</w:t>
-            </w:r>
-          </w:p>
-        </w:tc>
-        <w:tc>
-          <w:tcPr>
-            <w:tcW w:type="dxa" w:w="1140"/>
-            <w:tcBorders>
-              <w:top w:val="single" w:color="BFBFBF" w:sz="1"/>
-              <w:left w:val="single" w:color="BFBFBF" w:sz="1"/>
-              <w:bottom w:val="single" w:color="BFBFBF" w:sz="1"/>
-              <w:right w:val="single" w:color="BFBFBF" w:sz="1"/>
-            </w:tcBorders>
-            <w:tcMar>
-              <w:top w:type="dxa" w:w="60"/>
-              <w:left w:type="dxa" w:w="110"/>
-              <w:bottom w:type="dxa" w:w="60"/>
-              <w:right w:type="dxa" w:w="110"/>
-            </w:tcMar>
-          </w:tcPr>
-          <w:p>
-            <w:r>
-              <w:rPr>
-                <w:b w:val="false"/>
-                <w:bCs w:val="false"/>
-                <w:sz w:val="20"/>
-                <w:szCs w:val="20"/>
-              </w:rPr>
-              <w:t xml:space="preserve">5.502</w:t>
+              <w:t xml:space="preserve">+3.457</w:t>
+            </w:r>
+          </w:p>
+        </w:tc>
+        <w:tc>
+          <w:tcPr>
+            <w:tcW w:type="dxa" w:w="1200"/>
+            <w:tcBorders>
+              <w:top w:val="single" w:color="BFBFBF" w:sz="1"/>
+              <w:left w:val="single" w:color="BFBFBF" w:sz="1"/>
+              <w:bottom w:val="single" w:color="BFBFBF" w:sz="1"/>
+              <w:right w:val="single" w:color="BFBFBF" w:sz="1"/>
+            </w:tcBorders>
+            <w:tcMar>
+              <w:top w:type="dxa" w:w="60"/>
+              <w:left w:type="dxa" w:w="110"/>
+              <w:bottom w:type="dxa" w:w="60"/>
+              <w:right w:type="dxa" w:w="110"/>
+            </w:tcMar>
+          </w:tcPr>
+          <w:p>
+            <w:r>
+              <w:rPr>
+                <w:b w:val="false"/>
+                <w:bCs w:val="false"/>
+                <w:sz w:val="20"/>
+                <w:szCs w:val="20"/>
+              </w:rPr>
+              <w:t xml:space="preserve">5.595</w:t>
             </w:r>
           </w:p>
         </w:tc>
@@ -9294,7 +9294,7 @@
       <w:tr>
         <w:tc>
           <w:tcPr>
-            <w:tcW w:type="dxa" w:w="1560"/>
+            <w:tcW w:type="dxa" w:w="1500"/>
             <w:tcBorders>
               <w:top w:val="single" w:color="BFBFBF" w:sz="1"/>
               <w:left w:val="single" w:color="BFBFBF" w:sz="1"/>
@@ -9323,93 +9323,6 @@
         </w:tc>
         <w:tc>
           <w:tcPr>
-            <w:tcW w:type="dxa" w:w="1140"/>
-            <w:tcBorders>
-              <w:top w:val="single" w:color="BFBFBF" w:sz="1"/>
-              <w:left w:val="single" w:color="BFBFBF" w:sz="1"/>
-              <w:bottom w:val="single" w:color="BFBFBF" w:sz="1"/>
-              <w:right w:val="single" w:color="BFBFBF" w:sz="1"/>
-            </w:tcBorders>
-            <w:shd w:fill="F3F6FB" w:val="clear"/>
-            <w:tcMar>
-              <w:top w:type="dxa" w:w="60"/>
-              <w:left w:type="dxa" w:w="110"/>
-              <w:bottom w:type="dxa" w:w="60"/>
-              <w:right w:type="dxa" w:w="110"/>
-            </w:tcMar>
-          </w:tcPr>
-          <w:p>
-            <w:r>
-              <w:rPr>
-                <w:b w:val="false"/>
-                <w:bCs w:val="false"/>
-                <w:sz w:val="20"/>
-                <w:szCs w:val="20"/>
-              </w:rPr>
-              <w:t xml:space="preserve">+0.779</w:t>
-            </w:r>
-          </w:p>
-        </w:tc>
-        <w:tc>
-          <w:tcPr>
-            <w:tcW w:type="dxa" w:w="1140"/>
-            <w:tcBorders>
-              <w:top w:val="single" w:color="BFBFBF" w:sz="1"/>
-              <w:left w:val="single" w:color="BFBFBF" w:sz="1"/>
-              <w:bottom w:val="single" w:color="BFBFBF" w:sz="1"/>
-              <w:right w:val="single" w:color="BFBFBF" w:sz="1"/>
-            </w:tcBorders>
-            <w:shd w:fill="F3F6FB" w:val="clear"/>
-            <w:tcMar>
-              <w:top w:type="dxa" w:w="60"/>
-              <w:left w:type="dxa" w:w="110"/>
-              <w:bottom w:type="dxa" w:w="60"/>
-              <w:right w:type="dxa" w:w="110"/>
-            </w:tcMar>
-          </w:tcPr>
-          <w:p>
-            <w:r>
-              <w:rPr>
-                <w:b w:val="false"/>
-                <w:bCs w:val="false"/>
-                <w:sz w:val="20"/>
-                <w:szCs w:val="20"/>
-              </w:rPr>
-              <w:t xml:space="preserve">+1.978</w:t>
-            </w:r>
-          </w:p>
-        </w:tc>
-        <w:tc>
-          <w:tcPr>
-            <w:tcW w:type="dxa" w:w="1140"/>
-            <w:tcBorders>
-              <w:top w:val="single" w:color="BFBFBF" w:sz="1"/>
-              <w:left w:val="single" w:color="BFBFBF" w:sz="1"/>
-              <w:bottom w:val="single" w:color="BFBFBF" w:sz="1"/>
-              <w:right w:val="single" w:color="BFBFBF" w:sz="1"/>
-            </w:tcBorders>
-            <w:shd w:fill="F3F6FB" w:val="clear"/>
-            <w:tcMar>
-              <w:top w:type="dxa" w:w="60"/>
-              <w:left w:type="dxa" w:w="110"/>
-              <w:bottom w:type="dxa" w:w="60"/>
-              <w:right w:type="dxa" w:w="110"/>
-            </w:tcMar>
-          </w:tcPr>
-          <w:p>
-            <w:r>
-              <w:rPr>
-                <w:b w:val="false"/>
-                <w:bCs w:val="false"/>
-                <w:sz w:val="20"/>
-                <w:szCs w:val="20"/>
-              </w:rPr>
-              <w:t xml:space="preserve">+3.292</w:t>
-            </w:r>
-          </w:p>
-        </w:tc>
-        <w:tc>
-          <w:tcPr>
             <w:tcW w:type="dxa" w:w="1080"/>
             <w:tcBorders>
               <w:top w:val="single" w:color="BFBFBF" w:sz="1"/>
@@ -9433,7 +9346,7 @@
                 <w:sz w:val="20"/>
                 <w:szCs w:val="20"/>
               </w:rPr>
-              <w:t xml:space="preserve">−0.257</w:t>
+              <w:t xml:space="preserve">+0.869</w:t>
             </w:r>
           </w:p>
         </w:tc>
@@ -9462,36 +9375,7 @@
                 <w:sz w:val="20"/>
                 <w:szCs w:val="20"/>
               </w:rPr>
-              <w:t xml:space="preserve">+3.025</w:t>
-            </w:r>
-          </w:p>
-        </w:tc>
-        <w:tc>
-          <w:tcPr>
-            <w:tcW w:type="dxa" w:w="1140"/>
-            <w:tcBorders>
-              <w:top w:val="single" w:color="BFBFBF" w:sz="1"/>
-              <w:left w:val="single" w:color="BFBFBF" w:sz="1"/>
-              <w:bottom w:val="single" w:color="BFBFBF" w:sz="1"/>
-              <w:right w:val="single" w:color="BFBFBF" w:sz="1"/>
-            </w:tcBorders>
-            <w:shd w:fill="F3F6FB" w:val="clear"/>
-            <w:tcMar>
-              <w:top w:type="dxa" w:w="60"/>
-              <w:left w:type="dxa" w:w="110"/>
-              <w:bottom w:type="dxa" w:w="60"/>
-              <w:right w:type="dxa" w:w="110"/>
-            </w:tcMar>
-          </w:tcPr>
-          <w:p>
-            <w:r>
-              <w:rPr>
-                <w:b w:val="false"/>
-                <w:bCs w:val="false"/>
-                <w:sz w:val="20"/>
-                <w:szCs w:val="20"/>
-              </w:rPr>
-              <w:t xml:space="preserve">4.827</w:t>
+              <w:t xml:space="preserve">+2.151</w:t>
             </w:r>
           </w:p>
         </w:tc>
@@ -9520,7 +9404,123 @@
                 <w:sz w:val="20"/>
                 <w:szCs w:val="20"/>
               </w:rPr>
-              <w:t xml:space="preserve">0.029</w:t>
+              <w:t xml:space="preserve">+3.500</w:t>
+            </w:r>
+          </w:p>
+        </w:tc>
+        <w:tc>
+          <w:tcPr>
+            <w:tcW w:type="dxa" w:w="1080"/>
+            <w:tcBorders>
+              <w:top w:val="single" w:color="BFBFBF" w:sz="1"/>
+              <w:left w:val="single" w:color="BFBFBF" w:sz="1"/>
+              <w:bottom w:val="single" w:color="BFBFBF" w:sz="1"/>
+              <w:right w:val="single" w:color="BFBFBF" w:sz="1"/>
+            </w:tcBorders>
+            <w:shd w:fill="F3F6FB" w:val="clear"/>
+            <w:tcMar>
+              <w:top w:type="dxa" w:w="60"/>
+              <w:left w:type="dxa" w:w="110"/>
+              <w:bottom w:type="dxa" w:w="60"/>
+              <w:right w:type="dxa" w:w="110"/>
+            </w:tcMar>
+          </w:tcPr>
+          <w:p>
+            <w:r>
+              <w:rPr>
+                <w:b w:val="false"/>
+                <w:bCs w:val="false"/>
+                <w:sz w:val="20"/>
+                <w:szCs w:val="20"/>
+              </w:rPr>
+              <w:t xml:space="preserve">−0.252</w:t>
+            </w:r>
+          </w:p>
+        </w:tc>
+        <w:tc>
+          <w:tcPr>
+            <w:tcW w:type="dxa" w:w="1080"/>
+            <w:tcBorders>
+              <w:top w:val="single" w:color="BFBFBF" w:sz="1"/>
+              <w:left w:val="single" w:color="BFBFBF" w:sz="1"/>
+              <w:bottom w:val="single" w:color="BFBFBF" w:sz="1"/>
+              <w:right w:val="single" w:color="BFBFBF" w:sz="1"/>
+            </w:tcBorders>
+            <w:shd w:fill="F3F6FB" w:val="clear"/>
+            <w:tcMar>
+              <w:top w:type="dxa" w:w="60"/>
+              <w:left w:type="dxa" w:w="110"/>
+              <w:bottom w:type="dxa" w:w="60"/>
+              <w:right w:type="dxa" w:w="110"/>
+            </w:tcMar>
+          </w:tcPr>
+          <w:p>
+            <w:r>
+              <w:rPr>
+                <w:b w:val="false"/>
+                <w:bCs w:val="false"/>
+                <w:sz w:val="20"/>
+                <w:szCs w:val="20"/>
+              </w:rPr>
+              <w:t xml:space="preserve">+3.443</w:t>
+            </w:r>
+          </w:p>
+        </w:tc>
+        <w:tc>
+          <w:tcPr>
+            <w:tcW w:type="dxa" w:w="1200"/>
+            <w:tcBorders>
+              <w:top w:val="single" w:color="BFBFBF" w:sz="1"/>
+              <w:left w:val="single" w:color="BFBFBF" w:sz="1"/>
+              <w:bottom w:val="single" w:color="BFBFBF" w:sz="1"/>
+              <w:right w:val="single" w:color="BFBFBF" w:sz="1"/>
+            </w:tcBorders>
+            <w:shd w:fill="F3F6FB" w:val="clear"/>
+            <w:tcMar>
+              <w:top w:type="dxa" w:w="60"/>
+              <w:left w:type="dxa" w:w="110"/>
+              <w:bottom w:type="dxa" w:w="60"/>
+              <w:right w:type="dxa" w:w="110"/>
+            </w:tcMar>
+          </w:tcPr>
+          <w:p>
+            <w:r>
+              <w:rPr>
+                <w:b w:val="false"/>
+                <w:bCs w:val="false"/>
+                <w:sz w:val="20"/>
+                <w:szCs w:val="20"/>
+              </w:rPr>
+              <w:t xml:space="preserve">5.525</w:t>
+            </w:r>
+          </w:p>
+        </w:tc>
+        <w:tc>
+          <w:tcPr>
+            <w:tcW w:type="dxa" w:w="1080"/>
+            <w:tcBorders>
+              <w:top w:val="single" w:color="BFBFBF" w:sz="1"/>
+              <w:left w:val="single" w:color="BFBFBF" w:sz="1"/>
+              <w:bottom w:val="single" w:color="BFBFBF" w:sz="1"/>
+              <w:right w:val="single" w:color="BFBFBF" w:sz="1"/>
+            </w:tcBorders>
+            <w:shd w:fill="F3F6FB" w:val="clear"/>
+            <w:tcMar>
+              <w:top w:type="dxa" w:w="60"/>
+              <w:left w:type="dxa" w:w="110"/>
+              <w:bottom w:type="dxa" w:w="60"/>
+              <w:right w:type="dxa" w:w="110"/>
+            </w:tcMar>
+          </w:tcPr>
+          <w:p>
+            <w:r>
+              <w:rPr>
+                <w:b w:val="false"/>
+                <w:bCs w:val="false"/>
+                <w:sz w:val="20"/>
+                <w:szCs w:val="20"/>
+              </w:rPr>
+              <w:t xml:space="preserve">0.015</w:t>
             </w:r>
           </w:p>
         </w:tc>
@@ -9528,7 +9528,7 @@
       <w:tr>
         <w:tc>
           <w:tcPr>
-            <w:tcW w:type="dxa" w:w="1560"/>
+            <w:tcW w:type="dxa" w:w="1500"/>
             <w:tcBorders>
               <w:top w:val="single" w:color="BFBFBF" w:sz="1"/>
               <w:left w:val="single" w:color="BFBFBF" w:sz="1"/>
@@ -9556,7 +9556,7 @@
         </w:tc>
         <w:tc>
           <w:tcPr>
-            <w:tcW w:type="dxa" w:w="1140"/>
+            <w:tcW w:type="dxa" w:w="1080"/>
             <w:tcBorders>
               <w:top w:val="single" w:color="BFBFBF" w:sz="1"/>
               <w:left w:val="single" w:color="BFBFBF" w:sz="1"/>
@@ -9584,62 +9584,6 @@
         </w:tc>
         <w:tc>
           <w:tcPr>
-            <w:tcW w:type="dxa" w:w="1140"/>
-            <w:tcBorders>
-              <w:top w:val="single" w:color="BFBFBF" w:sz="1"/>
-              <w:left w:val="single" w:color="BFBFBF" w:sz="1"/>
-              <w:bottom w:val="single" w:color="BFBFBF" w:sz="1"/>
-              <w:right w:val="single" w:color="BFBFBF" w:sz="1"/>
-            </w:tcBorders>
-            <w:tcMar>
-              <w:top w:type="dxa" w:w="60"/>
-              <w:left w:type="dxa" w:w="110"/>
-              <w:bottom w:type="dxa" w:w="60"/>
-              <w:right w:type="dxa" w:w="110"/>
-            </w:tcMar>
-          </w:tcPr>
-          <w:p>
-            <w:r>
-              <w:rPr>
-                <w:b w:val="false"/>
-                <w:bCs w:val="false"/>
-                <w:sz w:val="20"/>
-                <w:szCs w:val="20"/>
-              </w:rPr>
-              <w:t xml:space="preserve">+1.915</w:t>
-            </w:r>
-          </w:p>
-        </w:tc>
-        <w:tc>
-          <w:tcPr>
-            <w:tcW w:type="dxa" w:w="1140"/>
-            <w:tcBorders>
-              <w:top w:val="single" w:color="BFBFBF" w:sz="1"/>
-              <w:left w:val="single" w:color="BFBFBF" w:sz="1"/>
-              <w:bottom w:val="single" w:color="BFBFBF" w:sz="1"/>
-              <w:right w:val="single" w:color="BFBFBF" w:sz="1"/>
-            </w:tcBorders>
-            <w:tcMar>
-              <w:top w:type="dxa" w:w="60"/>
-              <w:left w:type="dxa" w:w="110"/>
-              <w:bottom w:type="dxa" w:w="60"/>
-              <w:right w:type="dxa" w:w="110"/>
-            </w:tcMar>
-          </w:tcPr>
-          <w:p>
-            <w:r>
-              <w:rPr>
-                <w:b w:val="false"/>
-                <w:bCs w:val="false"/>
-                <w:sz w:val="20"/>
-                <w:szCs w:val="20"/>
-              </w:rPr>
-              <w:t xml:space="preserve">+2.974</w:t>
-            </w:r>
-          </w:p>
-        </w:tc>
-        <w:tc>
-          <w:tcPr>
             <w:tcW w:type="dxa" w:w="1080"/>
             <w:tcBorders>
               <w:top w:val="single" w:color="BFBFBF" w:sz="1"/>
@@ -9662,6 +9606,62 @@
                 <w:sz w:val="20"/>
                 <w:szCs w:val="20"/>
               </w:rPr>
+              <w:t xml:space="preserve">+1.942</w:t>
+            </w:r>
+          </w:p>
+        </w:tc>
+        <w:tc>
+          <w:tcPr>
+            <w:tcW w:type="dxa" w:w="1080"/>
+            <w:tcBorders>
+              <w:top w:val="single" w:color="BFBFBF" w:sz="1"/>
+              <w:left w:val="single" w:color="BFBFBF" w:sz="1"/>
+              <w:bottom w:val="single" w:color="BFBFBF" w:sz="1"/>
+              <w:right w:val="single" w:color="BFBFBF" w:sz="1"/>
+            </w:tcBorders>
+            <w:tcMar>
+              <w:top w:type="dxa" w:w="60"/>
+              <w:left w:type="dxa" w:w="110"/>
+              <w:bottom w:type="dxa" w:w="60"/>
+              <w:right w:type="dxa" w:w="110"/>
+            </w:tcMar>
+          </w:tcPr>
+          <w:p>
+            <w:r>
+              <w:rPr>
+                <w:b w:val="false"/>
+                <w:bCs w:val="false"/>
+                <w:sz w:val="20"/>
+                <w:szCs w:val="20"/>
+              </w:rPr>
+              <w:t xml:space="preserve">+3.083</w:t>
+            </w:r>
+          </w:p>
+        </w:tc>
+        <w:tc>
+          <w:tcPr>
+            <w:tcW w:type="dxa" w:w="1080"/>
+            <w:tcBorders>
+              <w:top w:val="single" w:color="BFBFBF" w:sz="1"/>
+              <w:left w:val="single" w:color="BFBFBF" w:sz="1"/>
+              <w:bottom w:val="single" w:color="BFBFBF" w:sz="1"/>
+              <w:right w:val="single" w:color="BFBFBF" w:sz="1"/>
+            </w:tcBorders>
+            <w:tcMar>
+              <w:top w:type="dxa" w:w="60"/>
+              <w:left w:type="dxa" w:w="110"/>
+              <w:bottom w:type="dxa" w:w="60"/>
+              <w:right w:type="dxa" w:w="110"/>
+            </w:tcMar>
+          </w:tcPr>
+          <w:p>
+            <w:r>
+              <w:rPr>
+                <w:b w:val="false"/>
+                <w:bCs w:val="false"/>
+                <w:sz w:val="20"/>
+                <w:szCs w:val="20"/>
+              </w:rPr>
               <w:t xml:space="preserve">−0.269</w:t>
             </w:r>
           </w:p>
@@ -9696,29 +9696,29 @@
         </w:tc>
         <w:tc>
           <w:tcPr>
-            <w:tcW w:type="dxa" w:w="1140"/>
-            <w:tcBorders>
-              <w:top w:val="single" w:color="BFBFBF" w:sz="1"/>
-              <w:left w:val="single" w:color="BFBFBF" w:sz="1"/>
-              <w:bottom w:val="single" w:color="BFBFBF" w:sz="1"/>
-              <w:right w:val="single" w:color="BFBFBF" w:sz="1"/>
-            </w:tcBorders>
-            <w:tcMar>
-              <w:top w:type="dxa" w:w="60"/>
-              <w:left w:type="dxa" w:w="110"/>
-              <w:bottom w:type="dxa" w:w="60"/>
-              <w:right w:type="dxa" w:w="110"/>
-            </w:tcMar>
-          </w:tcPr>
-          <w:p>
-            <w:r>
-              <w:rPr>
-                <w:b w:val="false"/>
-                <w:bCs w:val="false"/>
-                <w:sz w:val="20"/>
-                <w:szCs w:val="20"/>
-              </w:rPr>
-              <w:t xml:space="preserve">6.713</w:t>
+            <w:tcW w:type="dxa" w:w="1200"/>
+            <w:tcBorders>
+              <w:top w:val="single" w:color="BFBFBF" w:sz="1"/>
+              <w:left w:val="single" w:color="BFBFBF" w:sz="1"/>
+              <w:bottom w:val="single" w:color="BFBFBF" w:sz="1"/>
+              <w:right w:val="single" w:color="BFBFBF" w:sz="1"/>
+            </w:tcBorders>
+            <w:tcMar>
+              <w:top w:type="dxa" w:w="60"/>
+              <w:left w:type="dxa" w:w="110"/>
+              <w:bottom w:type="dxa" w:w="60"/>
+              <w:right w:type="dxa" w:w="110"/>
+            </w:tcMar>
+          </w:tcPr>
+          <w:p>
+            <w:r>
+              <w:rPr>
+                <w:b w:val="false"/>
+                <w:bCs w:val="false"/>
+                <w:sz w:val="20"/>
+                <w:szCs w:val="20"/>
+              </w:rPr>
+              <w:t xml:space="preserve">5.751</w:t>
             </w:r>
           </w:p>
         </w:tc>
@@ -9754,7 +9754,7 @@
       <w:tr>
         <w:tc>
           <w:tcPr>
-            <w:tcW w:type="dxa" w:w="1560"/>
+            <w:tcW w:type="dxa" w:w="1500"/>
             <w:tcBorders>
               <w:top w:val="single" w:color="BFBFBF" w:sz="1"/>
               <w:left w:val="single" w:color="BFBFBF" w:sz="1"/>
@@ -9783,93 +9783,6 @@
         </w:tc>
         <w:tc>
           <w:tcPr>
-            <w:tcW w:type="dxa" w:w="1140"/>
-            <w:tcBorders>
-              <w:top w:val="single" w:color="BFBFBF" w:sz="1"/>
-              <w:left w:val="single" w:color="BFBFBF" w:sz="1"/>
-              <w:bottom w:val="single" w:color="BFBFBF" w:sz="1"/>
-              <w:right w:val="single" w:color="BFBFBF" w:sz="1"/>
-            </w:tcBorders>
-            <w:shd w:fill="F3F6FB" w:val="clear"/>
-            <w:tcMar>
-              <w:top w:type="dxa" w:w="60"/>
-              <w:left w:type="dxa" w:w="110"/>
-              <w:bottom w:type="dxa" w:w="60"/>
-              <w:right w:type="dxa" w:w="110"/>
-            </w:tcMar>
-          </w:tcPr>
-          <w:p>
-            <w:r>
-              <w:rPr>
-                <w:b w:val="false"/>
-                <w:bCs w:val="false"/>
-                <w:sz w:val="20"/>
-                <w:szCs w:val="20"/>
-              </w:rPr>
-              <w:t xml:space="preserve">+0.893</w:t>
-            </w:r>
-          </w:p>
-        </w:tc>
-        <w:tc>
-          <w:tcPr>
-            <w:tcW w:type="dxa" w:w="1140"/>
-            <w:tcBorders>
-              <w:top w:val="single" w:color="BFBFBF" w:sz="1"/>
-              <w:left w:val="single" w:color="BFBFBF" w:sz="1"/>
-              <w:bottom w:val="single" w:color="BFBFBF" w:sz="1"/>
-              <w:right w:val="single" w:color="BFBFBF" w:sz="1"/>
-            </w:tcBorders>
-            <w:shd w:fill="F3F6FB" w:val="clear"/>
-            <w:tcMar>
-              <w:top w:type="dxa" w:w="60"/>
-              <w:left w:type="dxa" w:w="110"/>
-              <w:bottom w:type="dxa" w:w="60"/>
-              <w:right w:type="dxa" w:w="110"/>
-            </w:tcMar>
-          </w:tcPr>
-          <w:p>
-            <w:r>
-              <w:rPr>
-                <w:b w:val="false"/>
-                <w:bCs w:val="false"/>
-                <w:sz w:val="20"/>
-                <w:szCs w:val="20"/>
-              </w:rPr>
-              <w:t xml:space="preserve">+2.083</w:t>
-            </w:r>
-          </w:p>
-        </w:tc>
-        <w:tc>
-          <w:tcPr>
-            <w:tcW w:type="dxa" w:w="1140"/>
-            <w:tcBorders>
-              <w:top w:val="single" w:color="BFBFBF" w:sz="1"/>
-              <w:left w:val="single" w:color="BFBFBF" w:sz="1"/>
-              <w:bottom w:val="single" w:color="BFBFBF" w:sz="1"/>
-              <w:right w:val="single" w:color="BFBFBF" w:sz="1"/>
-            </w:tcBorders>
-            <w:shd w:fill="F3F6FB" w:val="clear"/>
-            <w:tcMar>
-              <w:top w:type="dxa" w:w="60"/>
-              <w:left w:type="dxa" w:w="110"/>
-              <w:bottom w:type="dxa" w:w="60"/>
-              <w:right w:type="dxa" w:w="110"/>
-            </w:tcMar>
-          </w:tcPr>
-          <w:p>
-            <w:r>
-              <w:rPr>
-                <w:b w:val="false"/>
-                <w:bCs w:val="false"/>
-                <w:sz w:val="20"/>
-                <w:szCs w:val="20"/>
-              </w:rPr>
-              <w:t xml:space="preserve">+3.309</w:t>
-            </w:r>
-          </w:p>
-        </w:tc>
-        <w:tc>
-          <w:tcPr>
             <w:tcW w:type="dxa" w:w="1080"/>
             <w:tcBorders>
               <w:top w:val="single" w:color="BFBFBF" w:sz="1"/>
@@ -9893,6 +9806,93 @@
                 <w:sz w:val="20"/>
                 <w:szCs w:val="20"/>
               </w:rPr>
+              <w:t xml:space="preserve">+0.882</w:t>
+            </w:r>
+          </w:p>
+        </w:tc>
+        <w:tc>
+          <w:tcPr>
+            <w:tcW w:type="dxa" w:w="1080"/>
+            <w:tcBorders>
+              <w:top w:val="single" w:color="BFBFBF" w:sz="1"/>
+              <w:left w:val="single" w:color="BFBFBF" w:sz="1"/>
+              <w:bottom w:val="single" w:color="BFBFBF" w:sz="1"/>
+              <w:right w:val="single" w:color="BFBFBF" w:sz="1"/>
+            </w:tcBorders>
+            <w:shd w:fill="F3F6FB" w:val="clear"/>
+            <w:tcMar>
+              <w:top w:type="dxa" w:w="60"/>
+              <w:left w:type="dxa" w:w="110"/>
+              <w:bottom w:type="dxa" w:w="60"/>
+              <w:right w:type="dxa" w:w="110"/>
+            </w:tcMar>
+          </w:tcPr>
+          <w:p>
+            <w:r>
+              <w:rPr>
+                <w:b w:val="false"/>
+                <w:bCs w:val="false"/>
+                <w:sz w:val="20"/>
+                <w:szCs w:val="20"/>
+              </w:rPr>
+              <w:t xml:space="preserve">+2.090</w:t>
+            </w:r>
+          </w:p>
+        </w:tc>
+        <w:tc>
+          <w:tcPr>
+            <w:tcW w:type="dxa" w:w="1080"/>
+            <w:tcBorders>
+              <w:top w:val="single" w:color="BFBFBF" w:sz="1"/>
+              <w:left w:val="single" w:color="BFBFBF" w:sz="1"/>
+              <w:bottom w:val="single" w:color="BFBFBF" w:sz="1"/>
+              <w:right w:val="single" w:color="BFBFBF" w:sz="1"/>
+            </w:tcBorders>
+            <w:shd w:fill="F3F6FB" w:val="clear"/>
+            <w:tcMar>
+              <w:top w:type="dxa" w:w="60"/>
+              <w:left w:type="dxa" w:w="110"/>
+              <w:bottom w:type="dxa" w:w="60"/>
+              <w:right w:type="dxa" w:w="110"/>
+            </w:tcMar>
+          </w:tcPr>
+          <w:p>
+            <w:r>
+              <w:rPr>
+                <w:b w:val="false"/>
+                <w:bCs w:val="false"/>
+                <w:sz w:val="20"/>
+                <w:szCs w:val="20"/>
+              </w:rPr>
+              <w:t xml:space="preserve">+3.390</w:t>
+            </w:r>
+          </w:p>
+        </w:tc>
+        <w:tc>
+          <w:tcPr>
+            <w:tcW w:type="dxa" w:w="1080"/>
+            <w:tcBorders>
+              <w:top w:val="single" w:color="BFBFBF" w:sz="1"/>
+              <w:left w:val="single" w:color="BFBFBF" w:sz="1"/>
+              <w:bottom w:val="single" w:color="BFBFBF" w:sz="1"/>
+              <w:right w:val="single" w:color="BFBFBF" w:sz="1"/>
+            </w:tcBorders>
+            <w:shd w:fill="F3F6FB" w:val="clear"/>
+            <w:tcMar>
+              <w:top w:type="dxa" w:w="60"/>
+              <w:left w:type="dxa" w:w="110"/>
+              <w:bottom w:type="dxa" w:w="60"/>
+              <w:right w:type="dxa" w:w="110"/>
+            </w:tcMar>
+          </w:tcPr>
+          <w:p>
+            <w:r>
+              <w:rPr>
+                <w:b w:val="false"/>
+                <w:bCs w:val="false"/>
+                <w:sz w:val="20"/>
+                <w:szCs w:val="20"/>
+              </w:rPr>
               <w:t xml:space="preserve">−0.263</w:t>
             </w:r>
           </w:p>
@@ -9922,36 +9922,36 @@
                 <w:sz w:val="20"/>
                 <w:szCs w:val="20"/>
               </w:rPr>
-              <w:t xml:space="preserve">+3.401</w:t>
-            </w:r>
-          </w:p>
-        </w:tc>
-        <w:tc>
-          <w:tcPr>
-            <w:tcW w:type="dxa" w:w="1140"/>
-            <w:tcBorders>
-              <w:top w:val="single" w:color="BFBFBF" w:sz="1"/>
-              <w:left w:val="single" w:color="BFBFBF" w:sz="1"/>
-              <w:bottom w:val="single" w:color="BFBFBF" w:sz="1"/>
-              <w:right w:val="single" w:color="BFBFBF" w:sz="1"/>
-            </w:tcBorders>
-            <w:shd w:fill="F3F6FB" w:val="clear"/>
-            <w:tcMar>
-              <w:top w:type="dxa" w:w="60"/>
-              <w:left w:type="dxa" w:w="110"/>
-              <w:bottom w:type="dxa" w:w="60"/>
-              <w:right w:type="dxa" w:w="110"/>
-            </w:tcMar>
-          </w:tcPr>
-          <w:p>
-            <w:r>
-              <w:rPr>
-                <w:b w:val="false"/>
-                <w:bCs w:val="false"/>
-                <w:sz w:val="20"/>
-                <w:szCs w:val="20"/>
-              </w:rPr>
-              <w:t xml:space="preserve">6.685</w:t>
+              <w:t xml:space="preserve">+3.354</w:t>
+            </w:r>
+          </w:p>
+        </w:tc>
+        <w:tc>
+          <w:tcPr>
+            <w:tcW w:type="dxa" w:w="1200"/>
+            <w:tcBorders>
+              <w:top w:val="single" w:color="BFBFBF" w:sz="1"/>
+              <w:left w:val="single" w:color="BFBFBF" w:sz="1"/>
+              <w:bottom w:val="single" w:color="BFBFBF" w:sz="1"/>
+              <w:right w:val="single" w:color="BFBFBF" w:sz="1"/>
+            </w:tcBorders>
+            <w:shd w:fill="F3F6FB" w:val="clear"/>
+            <w:tcMar>
+              <w:top w:type="dxa" w:w="60"/>
+              <w:left w:type="dxa" w:w="110"/>
+              <w:bottom w:type="dxa" w:w="60"/>
+              <w:right w:type="dxa" w:w="110"/>
+            </w:tcMar>
+          </w:tcPr>
+          <w:p>
+            <w:r>
+              <w:rPr>
+                <w:b w:val="false"/>
+                <w:bCs w:val="false"/>
+                <w:sz w:val="20"/>
+                <w:szCs w:val="20"/>
+              </w:rPr>
+              <w:t xml:space="preserve">5.636</w:t>
             </w:r>
           </w:p>
         </w:tc>
@@ -9988,7 +9988,7 @@
       <w:tr>
         <w:tc>
           <w:tcPr>
-            <w:tcW w:type="dxa" w:w="1560"/>
+            <w:tcW w:type="dxa" w:w="1500"/>
             <w:tcBorders>
               <w:top w:val="single" w:color="BFBFBF" w:sz="1"/>
               <w:left w:val="single" w:color="BFBFBF" w:sz="1"/>
@@ -10016,90 +10016,6 @@
         </w:tc>
         <w:tc>
           <w:tcPr>
-            <w:tcW w:type="dxa" w:w="1140"/>
-            <w:tcBorders>
-              <w:top w:val="single" w:color="BFBFBF" w:sz="1"/>
-              <w:left w:val="single" w:color="BFBFBF" w:sz="1"/>
-              <w:bottom w:val="single" w:color="BFBFBF" w:sz="1"/>
-              <w:right w:val="single" w:color="BFBFBF" w:sz="1"/>
-            </w:tcBorders>
-            <w:tcMar>
-              <w:top w:type="dxa" w:w="60"/>
-              <w:left w:type="dxa" w:w="110"/>
-              <w:bottom w:type="dxa" w:w="60"/>
-              <w:right w:type="dxa" w:w="110"/>
-            </w:tcMar>
-          </w:tcPr>
-          <w:p>
-            <w:r>
-              <w:rPr>
-                <w:b w:val="false"/>
-                <w:bCs w:val="false"/>
-                <w:sz w:val="20"/>
-                <w:szCs w:val="20"/>
-              </w:rPr>
-              <w:t xml:space="preserve">+0.912</w:t>
-            </w:r>
-          </w:p>
-        </w:tc>
-        <w:tc>
-          <w:tcPr>
-            <w:tcW w:type="dxa" w:w="1140"/>
-            <w:tcBorders>
-              <w:top w:val="single" w:color="BFBFBF" w:sz="1"/>
-              <w:left w:val="single" w:color="BFBFBF" w:sz="1"/>
-              <w:bottom w:val="single" w:color="BFBFBF" w:sz="1"/>
-              <w:right w:val="single" w:color="BFBFBF" w:sz="1"/>
-            </w:tcBorders>
-            <w:tcMar>
-              <w:top w:type="dxa" w:w="60"/>
-              <w:left w:type="dxa" w:w="110"/>
-              <w:bottom w:type="dxa" w:w="60"/>
-              <w:right w:type="dxa" w:w="110"/>
-            </w:tcMar>
-          </w:tcPr>
-          <w:p>
-            <w:r>
-              <w:rPr>
-                <w:b w:val="false"/>
-                <w:bCs w:val="false"/>
-                <w:sz w:val="20"/>
-                <w:szCs w:val="20"/>
-              </w:rPr>
-              <w:t xml:space="preserve">+1.973</w:t>
-            </w:r>
-          </w:p>
-        </w:tc>
-        <w:tc>
-          <w:tcPr>
-            <w:tcW w:type="dxa" w:w="1140"/>
-            <w:tcBorders>
-              <w:top w:val="single" w:color="BFBFBF" w:sz="1"/>
-              <w:left w:val="single" w:color="BFBFBF" w:sz="1"/>
-              <w:bottom w:val="single" w:color="BFBFBF" w:sz="1"/>
-              <w:right w:val="single" w:color="BFBFBF" w:sz="1"/>
-            </w:tcBorders>
-            <w:tcMar>
-              <w:top w:type="dxa" w:w="60"/>
-              <w:left w:type="dxa" w:w="110"/>
-              <w:bottom w:type="dxa" w:w="60"/>
-              <w:right w:type="dxa" w:w="110"/>
-            </w:tcMar>
-          </w:tcPr>
-          <w:p>
-            <w:r>
-              <w:rPr>
-                <w:b w:val="false"/>
-                <w:bCs w:val="false"/>
-                <w:sz w:val="20"/>
-                <w:szCs w:val="20"/>
-              </w:rPr>
-              <w:t xml:space="preserve">+3.153</w:t>
-            </w:r>
-          </w:p>
-        </w:tc>
-        <w:tc>
-          <w:tcPr>
             <w:tcW w:type="dxa" w:w="1080"/>
             <w:tcBorders>
               <w:top w:val="single" w:color="BFBFBF" w:sz="1"/>
@@ -10122,7 +10038,7 @@
                 <w:sz w:val="20"/>
                 <w:szCs w:val="20"/>
               </w:rPr>
-              <w:t xml:space="preserve">−0.335</w:t>
+              <w:t xml:space="preserve">+0.895</w:t>
             </w:r>
           </w:p>
         </w:tc>
@@ -10150,35 +10066,7 @@
                 <w:sz w:val="20"/>
                 <w:szCs w:val="20"/>
               </w:rPr>
-              <w:t xml:space="preserve">+2.726</w:t>
-            </w:r>
-          </w:p>
-        </w:tc>
-        <w:tc>
-          <w:tcPr>
-            <w:tcW w:type="dxa" w:w="1140"/>
-            <w:tcBorders>
-              <w:top w:val="single" w:color="BFBFBF" w:sz="1"/>
-              <w:left w:val="single" w:color="BFBFBF" w:sz="1"/>
-              <w:bottom w:val="single" w:color="BFBFBF" w:sz="1"/>
-              <w:right w:val="single" w:color="BFBFBF" w:sz="1"/>
-            </w:tcBorders>
-            <w:tcMar>
-              <w:top w:type="dxa" w:w="60"/>
-              <w:left w:type="dxa" w:w="110"/>
-              <w:bottom w:type="dxa" w:w="60"/>
-              <w:right w:type="dxa" w:w="110"/>
-            </w:tcMar>
-          </w:tcPr>
-          <w:p>
-            <w:r>
-              <w:rPr>
-                <w:b w:val="false"/>
-                <w:bCs w:val="false"/>
-                <w:sz w:val="20"/>
-                <w:szCs w:val="20"/>
-              </w:rPr>
-              <w:t xml:space="preserve">6.888</w:t>
+              <w:t xml:space="preserve">+1.959</w:t>
             </w:r>
           </w:p>
         </w:tc>
@@ -10206,7 +10094,119 @@
                 <w:sz w:val="20"/>
                 <w:szCs w:val="20"/>
               </w:rPr>
-              <w:t xml:space="preserve">0.030</w:t>
+              <w:t xml:space="preserve">+3.186</w:t>
+            </w:r>
+          </w:p>
+        </w:tc>
+        <w:tc>
+          <w:tcPr>
+            <w:tcW w:type="dxa" w:w="1080"/>
+            <w:tcBorders>
+              <w:top w:val="single" w:color="BFBFBF" w:sz="1"/>
+              <w:left w:val="single" w:color="BFBFBF" w:sz="1"/>
+              <w:bottom w:val="single" w:color="BFBFBF" w:sz="1"/>
+              <w:right w:val="single" w:color="BFBFBF" w:sz="1"/>
+            </w:tcBorders>
+            <w:tcMar>
+              <w:top w:type="dxa" w:w="60"/>
+              <w:left w:type="dxa" w:w="110"/>
+              <w:bottom w:type="dxa" w:w="60"/>
+              <w:right w:type="dxa" w:w="110"/>
+            </w:tcMar>
+          </w:tcPr>
+          <w:p>
+            <w:r>
+              <w:rPr>
+                <w:b w:val="false"/>
+                <w:bCs w:val="false"/>
+                <w:sz w:val="20"/>
+                <w:szCs w:val="20"/>
+              </w:rPr>
+              <w:t xml:space="preserve">−0.338</w:t>
+            </w:r>
+          </w:p>
+        </w:tc>
+        <w:tc>
+          <w:tcPr>
+            <w:tcW w:type="dxa" w:w="1080"/>
+            <w:tcBorders>
+              <w:top w:val="single" w:color="BFBFBF" w:sz="1"/>
+              <w:left w:val="single" w:color="BFBFBF" w:sz="1"/>
+              <w:bottom w:val="single" w:color="BFBFBF" w:sz="1"/>
+              <w:right w:val="single" w:color="BFBFBF" w:sz="1"/>
+            </w:tcBorders>
+            <w:tcMar>
+              <w:top w:type="dxa" w:w="60"/>
+              <w:left w:type="dxa" w:w="110"/>
+              <w:bottom w:type="dxa" w:w="60"/>
+              <w:right w:type="dxa" w:w="110"/>
+            </w:tcMar>
+          </w:tcPr>
+          <w:p>
+            <w:r>
+              <w:rPr>
+                <w:b w:val="false"/>
+                <w:bCs w:val="false"/>
+                <w:sz w:val="20"/>
+                <w:szCs w:val="20"/>
+              </w:rPr>
+              <w:t xml:space="preserve">+2.651</w:t>
+            </w:r>
+          </w:p>
+        </w:tc>
+        <w:tc>
+          <w:tcPr>
+            <w:tcW w:type="dxa" w:w="1200"/>
+            <w:tcBorders>
+              <w:top w:val="single" w:color="BFBFBF" w:sz="1"/>
+              <w:left w:val="single" w:color="BFBFBF" w:sz="1"/>
+              <w:bottom w:val="single" w:color="BFBFBF" w:sz="1"/>
+              <w:right w:val="single" w:color="BFBFBF" w:sz="1"/>
+            </w:tcBorders>
+            <w:tcMar>
+              <w:top w:type="dxa" w:w="60"/>
+              <w:left w:type="dxa" w:w="110"/>
+              <w:bottom w:type="dxa" w:w="60"/>
+              <w:right w:type="dxa" w:w="110"/>
+            </w:tcMar>
+          </w:tcPr>
+          <w:p>
+            <w:r>
+              <w:rPr>
+                <w:b w:val="false"/>
+                <w:bCs w:val="false"/>
+                <w:sz w:val="20"/>
+                <w:szCs w:val="20"/>
+              </w:rPr>
+              <w:t xml:space="preserve">5.739</w:t>
+            </w:r>
+          </w:p>
+        </w:tc>
+        <w:tc>
+          <w:tcPr>
+            <w:tcW w:type="dxa" w:w="1080"/>
+            <w:tcBorders>
+              <w:top w:val="single" w:color="BFBFBF" w:sz="1"/>
+              <w:left w:val="single" w:color="BFBFBF" w:sz="1"/>
+              <w:bottom w:val="single" w:color="BFBFBF" w:sz="1"/>
+              <w:right w:val="single" w:color="BFBFBF" w:sz="1"/>
+            </w:tcBorders>
+            <w:tcMar>
+              <w:top w:type="dxa" w:w="60"/>
+              <w:left w:type="dxa" w:w="110"/>
+              <w:bottom w:type="dxa" w:w="60"/>
+              <w:right w:type="dxa" w:w="110"/>
+            </w:tcMar>
+          </w:tcPr>
+          <w:p>
+            <w:r>
+              <w:rPr>
+                <w:b w:val="false"/>
+                <w:bCs w:val="false"/>
+                <w:sz w:val="20"/>
+                <w:szCs w:val="20"/>
+              </w:rPr>
+              <w:t xml:space="preserve">0.033</w:t>
             </w:r>
           </w:p>
         </w:tc>
@@ -10214,7 +10214,7 @@
       <w:tr>
         <w:tc>
           <w:tcPr>
-            <w:tcW w:type="dxa" w:w="1560"/>
+            <w:tcW w:type="dxa" w:w="1500"/>
             <w:tcBorders>
               <w:top w:val="single" w:color="BFBFBF" w:sz="1"/>
               <w:left w:val="single" w:color="BFBFBF" w:sz="1"/>
@@ -10243,93 +10243,6 @@
         </w:tc>
         <w:tc>
           <w:tcPr>
-            <w:tcW w:type="dxa" w:w="1140"/>
-            <w:tcBorders>
-              <w:top w:val="single" w:color="BFBFBF" w:sz="1"/>
-              <w:left w:val="single" w:color="BFBFBF" w:sz="1"/>
-              <w:bottom w:val="single" w:color="BFBFBF" w:sz="1"/>
-              <w:right w:val="single" w:color="BFBFBF" w:sz="1"/>
-            </w:tcBorders>
-            <w:shd w:fill="F3F6FB" w:val="clear"/>
-            <w:tcMar>
-              <w:top w:type="dxa" w:w="60"/>
-              <w:left w:type="dxa" w:w="110"/>
-              <w:bottom w:type="dxa" w:w="60"/>
-              <w:right w:type="dxa" w:w="110"/>
-            </w:tcMar>
-          </w:tcPr>
-          <w:p>
-            <w:r>
-              <w:rPr>
-                <w:b w:val="false"/>
-                <w:bCs w:val="false"/>
-                <w:sz w:val="20"/>
-                <w:szCs w:val="20"/>
-              </w:rPr>
-              <w:t xml:space="preserve">—</w:t>
-            </w:r>
-          </w:p>
-        </w:tc>
-        <w:tc>
-          <w:tcPr>
-            <w:tcW w:type="dxa" w:w="1140"/>
-            <w:tcBorders>
-              <w:top w:val="single" w:color="BFBFBF" w:sz="1"/>
-              <w:left w:val="single" w:color="BFBFBF" w:sz="1"/>
-              <w:bottom w:val="single" w:color="BFBFBF" w:sz="1"/>
-              <w:right w:val="single" w:color="BFBFBF" w:sz="1"/>
-            </w:tcBorders>
-            <w:shd w:fill="F3F6FB" w:val="clear"/>
-            <w:tcMar>
-              <w:top w:type="dxa" w:w="60"/>
-              <w:left w:type="dxa" w:w="110"/>
-              <w:bottom w:type="dxa" w:w="60"/>
-              <w:right w:type="dxa" w:w="110"/>
-            </w:tcMar>
-          </w:tcPr>
-          <w:p>
-            <w:r>
-              <w:rPr>
-                <w:b w:val="false"/>
-                <w:bCs w:val="false"/>
-                <w:sz w:val="20"/>
-                <w:szCs w:val="20"/>
-              </w:rPr>
-              <w:t xml:space="preserve">+2.119</w:t>
-            </w:r>
-          </w:p>
-        </w:tc>
-        <w:tc>
-          <w:tcPr>
-            <w:tcW w:type="dxa" w:w="1140"/>
-            <w:tcBorders>
-              <w:top w:val="single" w:color="BFBFBF" w:sz="1"/>
-              <w:left w:val="single" w:color="BFBFBF" w:sz="1"/>
-              <w:bottom w:val="single" w:color="BFBFBF" w:sz="1"/>
-              <w:right w:val="single" w:color="BFBFBF" w:sz="1"/>
-            </w:tcBorders>
-            <w:shd w:fill="F3F6FB" w:val="clear"/>
-            <w:tcMar>
-              <w:top w:type="dxa" w:w="60"/>
-              <w:left w:type="dxa" w:w="110"/>
-              <w:bottom w:type="dxa" w:w="60"/>
-              <w:right w:type="dxa" w:w="110"/>
-            </w:tcMar>
-          </w:tcPr>
-          <w:p>
-            <w:r>
-              <w:rPr>
-                <w:b w:val="false"/>
-                <w:bCs w:val="false"/>
-                <w:sz w:val="20"/>
-                <w:szCs w:val="20"/>
-              </w:rPr>
-              <w:t xml:space="preserve">—</w:t>
-            </w:r>
-          </w:p>
-        </w:tc>
-        <w:tc>
-          <w:tcPr>
             <w:tcW w:type="dxa" w:w="1080"/>
             <w:tcBorders>
               <w:top w:val="single" w:color="BFBFBF" w:sz="1"/>
@@ -10353,6 +10266,93 @@
                 <w:sz w:val="20"/>
                 <w:szCs w:val="20"/>
               </w:rPr>
+              <w:t xml:space="preserve">+0.894</w:t>
+            </w:r>
+          </w:p>
+        </w:tc>
+        <w:tc>
+          <w:tcPr>
+            <w:tcW w:type="dxa" w:w="1080"/>
+            <w:tcBorders>
+              <w:top w:val="single" w:color="BFBFBF" w:sz="1"/>
+              <w:left w:val="single" w:color="BFBFBF" w:sz="1"/>
+              <w:bottom w:val="single" w:color="BFBFBF" w:sz="1"/>
+              <w:right w:val="single" w:color="BFBFBF" w:sz="1"/>
+            </w:tcBorders>
+            <w:shd w:fill="F3F6FB" w:val="clear"/>
+            <w:tcMar>
+              <w:top w:type="dxa" w:w="60"/>
+              <w:left w:type="dxa" w:w="110"/>
+              <w:bottom w:type="dxa" w:w="60"/>
+              <w:right w:type="dxa" w:w="110"/>
+            </w:tcMar>
+          </w:tcPr>
+          <w:p>
+            <w:r>
+              <w:rPr>
+                <w:b w:val="false"/>
+                <w:bCs w:val="false"/>
+                <w:sz w:val="20"/>
+                <w:szCs w:val="20"/>
+              </w:rPr>
+              <w:t xml:space="preserve">+2.135</w:t>
+            </w:r>
+          </w:p>
+        </w:tc>
+        <w:tc>
+          <w:tcPr>
+            <w:tcW w:type="dxa" w:w="1080"/>
+            <w:tcBorders>
+              <w:top w:val="single" w:color="BFBFBF" w:sz="1"/>
+              <w:left w:val="single" w:color="BFBFBF" w:sz="1"/>
+              <w:bottom w:val="single" w:color="BFBFBF" w:sz="1"/>
+              <w:right w:val="single" w:color="BFBFBF" w:sz="1"/>
+            </w:tcBorders>
+            <w:shd w:fill="F3F6FB" w:val="clear"/>
+            <w:tcMar>
+              <w:top w:type="dxa" w:w="60"/>
+              <w:left w:type="dxa" w:w="110"/>
+              <w:bottom w:type="dxa" w:w="60"/>
+              <w:right w:type="dxa" w:w="110"/>
+            </w:tcMar>
+          </w:tcPr>
+          <w:p>
+            <w:r>
+              <w:rPr>
+                <w:b w:val="false"/>
+                <w:bCs w:val="false"/>
+                <w:sz w:val="20"/>
+                <w:szCs w:val="20"/>
+              </w:rPr>
+              <w:t xml:space="preserve">+3.466</w:t>
+            </w:r>
+          </w:p>
+        </w:tc>
+        <w:tc>
+          <w:tcPr>
+            <w:tcW w:type="dxa" w:w="1080"/>
+            <w:tcBorders>
+              <w:top w:val="single" w:color="BFBFBF" w:sz="1"/>
+              <w:left w:val="single" w:color="BFBFBF" w:sz="1"/>
+              <w:bottom w:val="single" w:color="BFBFBF" w:sz="1"/>
+              <w:right w:val="single" w:color="BFBFBF" w:sz="1"/>
+            </w:tcBorders>
+            <w:shd w:fill="F3F6FB" w:val="clear"/>
+            <w:tcMar>
+              <w:top w:type="dxa" w:w="60"/>
+              <w:left w:type="dxa" w:w="110"/>
+              <w:bottom w:type="dxa" w:w="60"/>
+              <w:right w:type="dxa" w:w="110"/>
+            </w:tcMar>
+          </w:tcPr>
+          <w:p>
+            <w:r>
+              <w:rPr>
+                <w:b w:val="false"/>
+                <w:bCs w:val="false"/>
+                <w:sz w:val="20"/>
+                <w:szCs w:val="20"/>
+              </w:rPr>
               <w:t xml:space="preserve">−0.253</w:t>
             </w:r>
           </w:p>
@@ -10382,36 +10382,36 @@
                 <w:sz w:val="20"/>
                 <w:szCs w:val="20"/>
               </w:rPr>
-              <w:t xml:space="preserve">+3.563</w:t>
-            </w:r>
-          </w:p>
-        </w:tc>
-        <w:tc>
-          <w:tcPr>
-            <w:tcW w:type="dxa" w:w="1140"/>
-            <w:tcBorders>
-              <w:top w:val="single" w:color="BFBFBF" w:sz="1"/>
-              <w:left w:val="single" w:color="BFBFBF" w:sz="1"/>
-              <w:bottom w:val="single" w:color="BFBFBF" w:sz="1"/>
-              <w:right w:val="single" w:color="BFBFBF" w:sz="1"/>
-            </w:tcBorders>
-            <w:shd w:fill="F3F6FB" w:val="clear"/>
-            <w:tcMar>
-              <w:top w:type="dxa" w:w="60"/>
-              <w:left w:type="dxa" w:w="110"/>
-              <w:bottom w:type="dxa" w:w="60"/>
-              <w:right w:type="dxa" w:w="110"/>
-            </w:tcMar>
-          </w:tcPr>
-          <w:p>
-            <w:r>
-              <w:rPr>
-                <w:b w:val="false"/>
-                <w:bCs w:val="false"/>
-                <w:sz w:val="20"/>
-                <w:szCs w:val="20"/>
-              </w:rPr>
-              <w:t xml:space="preserve">6.755</w:t>
+              <w:t xml:space="preserve">+3.536</w:t>
+            </w:r>
+          </w:p>
+        </w:tc>
+        <w:tc>
+          <w:tcPr>
+            <w:tcW w:type="dxa" w:w="1200"/>
+            <w:tcBorders>
+              <w:top w:val="single" w:color="BFBFBF" w:sz="1"/>
+              <w:left w:val="single" w:color="BFBFBF" w:sz="1"/>
+              <w:bottom w:val="single" w:color="BFBFBF" w:sz="1"/>
+              <w:right w:val="single" w:color="BFBFBF" w:sz="1"/>
+            </w:tcBorders>
+            <w:shd w:fill="F3F6FB" w:val="clear"/>
+            <w:tcMar>
+              <w:top w:type="dxa" w:w="60"/>
+              <w:left w:type="dxa" w:w="110"/>
+              <w:bottom w:type="dxa" w:w="60"/>
+              <w:right w:type="dxa" w:w="110"/>
+            </w:tcMar>
+          </w:tcPr>
+          <w:p>
+            <w:r>
+              <w:rPr>
+                <w:b w:val="false"/>
+                <w:bCs w:val="false"/>
+                <w:sz w:val="20"/>
+                <w:szCs w:val="20"/>
+              </w:rPr>
+              <w:t xml:space="preserve">5.733</w:t>
             </w:r>
           </w:p>
         </w:tc>
@@ -10448,7 +10448,7 @@
       <w:tr>
         <w:tc>
           <w:tcPr>
-            <w:tcW w:type="dxa" w:w="1560"/>
+            <w:tcW w:type="dxa" w:w="1500"/>
             <w:tcBorders>
               <w:top w:val="single" w:color="BFBFBF" w:sz="1"/>
               <w:left w:val="single" w:color="BFBFBF" w:sz="1"/>
@@ -10476,90 +10476,6 @@
         </w:tc>
         <w:tc>
           <w:tcPr>
-            <w:tcW w:type="dxa" w:w="1140"/>
-            <w:tcBorders>
-              <w:top w:val="single" w:color="BFBFBF" w:sz="1"/>
-              <w:left w:val="single" w:color="BFBFBF" w:sz="1"/>
-              <w:bottom w:val="single" w:color="BFBFBF" w:sz="1"/>
-              <w:right w:val="single" w:color="BFBFBF" w:sz="1"/>
-            </w:tcBorders>
-            <w:tcMar>
-              <w:top w:type="dxa" w:w="60"/>
-              <w:left w:type="dxa" w:w="110"/>
-              <w:bottom w:type="dxa" w:w="60"/>
-              <w:right w:type="dxa" w:w="110"/>
-            </w:tcMar>
-          </w:tcPr>
-          <w:p>
-            <w:r>
-              <w:rPr>
-                <w:b w:val="false"/>
-                <w:bCs w:val="false"/>
-                <w:sz w:val="20"/>
-                <w:szCs w:val="20"/>
-              </w:rPr>
-              <w:t xml:space="preserve">—</w:t>
-            </w:r>
-          </w:p>
-        </w:tc>
-        <w:tc>
-          <w:tcPr>
-            <w:tcW w:type="dxa" w:w="1140"/>
-            <w:tcBorders>
-              <w:top w:val="single" w:color="BFBFBF" w:sz="1"/>
-              <w:left w:val="single" w:color="BFBFBF" w:sz="1"/>
-              <w:bottom w:val="single" w:color="BFBFBF" w:sz="1"/>
-              <w:right w:val="single" w:color="BFBFBF" w:sz="1"/>
-            </w:tcBorders>
-            <w:tcMar>
-              <w:top w:type="dxa" w:w="60"/>
-              <w:left w:type="dxa" w:w="110"/>
-              <w:bottom w:type="dxa" w:w="60"/>
-              <w:right w:type="dxa" w:w="110"/>
-            </w:tcMar>
-          </w:tcPr>
-          <w:p>
-            <w:r>
-              <w:rPr>
-                <w:b w:val="false"/>
-                <w:bCs w:val="false"/>
-                <w:sz w:val="20"/>
-                <w:szCs w:val="20"/>
-              </w:rPr>
-              <w:t xml:space="preserve">+2.142</w:t>
-            </w:r>
-          </w:p>
-        </w:tc>
-        <w:tc>
-          <w:tcPr>
-            <w:tcW w:type="dxa" w:w="1140"/>
-            <w:tcBorders>
-              <w:top w:val="single" w:color="BFBFBF" w:sz="1"/>
-              <w:left w:val="single" w:color="BFBFBF" w:sz="1"/>
-              <w:bottom w:val="single" w:color="BFBFBF" w:sz="1"/>
-              <w:right w:val="single" w:color="BFBFBF" w:sz="1"/>
-            </w:tcBorders>
-            <w:tcMar>
-              <w:top w:type="dxa" w:w="60"/>
-              <w:left w:type="dxa" w:w="110"/>
-              <w:bottom w:type="dxa" w:w="60"/>
-              <w:right w:type="dxa" w:w="110"/>
-            </w:tcMar>
-          </w:tcPr>
-          <w:p>
-            <w:r>
-              <w:rPr>
-                <w:b w:val="false"/>
-                <w:bCs w:val="false"/>
-                <w:sz w:val="20"/>
-                <w:szCs w:val="20"/>
-              </w:rPr>
-              <w:t xml:space="preserve">—</w:t>
-            </w:r>
-          </w:p>
-        </w:tc>
-        <w:tc>
-          <w:tcPr>
             <w:tcW w:type="dxa" w:w="1080"/>
             <w:tcBorders>
               <w:top w:val="single" w:color="BFBFBF" w:sz="1"/>
@@ -10582,6 +10498,90 @@
                 <w:sz w:val="20"/>
                 <w:szCs w:val="20"/>
               </w:rPr>
+              <w:t xml:space="preserve">+0.917</w:t>
+            </w:r>
+          </w:p>
+        </w:tc>
+        <w:tc>
+          <w:tcPr>
+            <w:tcW w:type="dxa" w:w="1080"/>
+            <w:tcBorders>
+              <w:top w:val="single" w:color="BFBFBF" w:sz="1"/>
+              <w:left w:val="single" w:color="BFBFBF" w:sz="1"/>
+              <w:bottom w:val="single" w:color="BFBFBF" w:sz="1"/>
+              <w:right w:val="single" w:color="BFBFBF" w:sz="1"/>
+            </w:tcBorders>
+            <w:tcMar>
+              <w:top w:type="dxa" w:w="60"/>
+              <w:left w:type="dxa" w:w="110"/>
+              <w:bottom w:type="dxa" w:w="60"/>
+              <w:right w:type="dxa" w:w="110"/>
+            </w:tcMar>
+          </w:tcPr>
+          <w:p>
+            <w:r>
+              <w:rPr>
+                <w:b w:val="false"/>
+                <w:bCs w:val="false"/>
+                <w:sz w:val="20"/>
+                <w:szCs w:val="20"/>
+              </w:rPr>
+              <w:t xml:space="preserve">+2.162</w:t>
+            </w:r>
+          </w:p>
+        </w:tc>
+        <w:tc>
+          <w:tcPr>
+            <w:tcW w:type="dxa" w:w="1080"/>
+            <w:tcBorders>
+              <w:top w:val="single" w:color="BFBFBF" w:sz="1"/>
+              <w:left w:val="single" w:color="BFBFBF" w:sz="1"/>
+              <w:bottom w:val="single" w:color="BFBFBF" w:sz="1"/>
+              <w:right w:val="single" w:color="BFBFBF" w:sz="1"/>
+            </w:tcBorders>
+            <w:tcMar>
+              <w:top w:type="dxa" w:w="60"/>
+              <w:left w:type="dxa" w:w="110"/>
+              <w:bottom w:type="dxa" w:w="60"/>
+              <w:right w:type="dxa" w:w="110"/>
+            </w:tcMar>
+          </w:tcPr>
+          <w:p>
+            <w:r>
+              <w:rPr>
+                <w:b w:val="false"/>
+                <w:bCs w:val="false"/>
+                <w:sz w:val="20"/>
+                <w:szCs w:val="20"/>
+              </w:rPr>
+              <w:t xml:space="preserve">+3.515</w:t>
+            </w:r>
+          </w:p>
+        </w:tc>
+        <w:tc>
+          <w:tcPr>
+            <w:tcW w:type="dxa" w:w="1080"/>
+            <w:tcBorders>
+              <w:top w:val="single" w:color="BFBFBF" w:sz="1"/>
+              <w:left w:val="single" w:color="BFBFBF" w:sz="1"/>
+              <w:bottom w:val="single" w:color="BFBFBF" w:sz="1"/>
+              <w:right w:val="single" w:color="BFBFBF" w:sz="1"/>
+            </w:tcBorders>
+            <w:tcMar>
+              <w:top w:type="dxa" w:w="60"/>
+              <w:left w:type="dxa" w:w="110"/>
+              <w:bottom w:type="dxa" w:w="60"/>
+              <w:right w:type="dxa" w:w="110"/>
+            </w:tcMar>
+          </w:tcPr>
+          <w:p>
+            <w:r>
+              <w:rPr>
+                <w:b w:val="false"/>
+                <w:bCs w:val="false"/>
+                <w:sz w:val="20"/>
+                <w:szCs w:val="20"/>
+              </w:rPr>
               <w:t xml:space="preserve">−0.255</w:t>
             </w:r>
           </w:p>
@@ -10610,35 +10610,35 @@
                 <w:sz w:val="20"/>
                 <w:szCs w:val="20"/>
               </w:rPr>
-              <w:t xml:space="preserve">+3.606</w:t>
-            </w:r>
-          </w:p>
-        </w:tc>
-        <w:tc>
-          <w:tcPr>
-            <w:tcW w:type="dxa" w:w="1140"/>
-            <w:tcBorders>
-              <w:top w:val="single" w:color="BFBFBF" w:sz="1"/>
-              <w:left w:val="single" w:color="BFBFBF" w:sz="1"/>
-              <w:bottom w:val="single" w:color="BFBFBF" w:sz="1"/>
-              <w:right w:val="single" w:color="BFBFBF" w:sz="1"/>
-            </w:tcBorders>
-            <w:tcMar>
-              <w:top w:type="dxa" w:w="60"/>
-              <w:left w:type="dxa" w:w="110"/>
-              <w:bottom w:type="dxa" w:w="60"/>
-              <w:right w:type="dxa" w:w="110"/>
-            </w:tcMar>
-          </w:tcPr>
-          <w:p>
-            <w:r>
-              <w:rPr>
-                <w:b w:val="false"/>
-                <w:bCs w:val="false"/>
-                <w:sz w:val="20"/>
-                <w:szCs w:val="20"/>
-              </w:rPr>
-              <w:t xml:space="preserve">6.970</w:t>
+              <w:t xml:space="preserve">+3.590</w:t>
+            </w:r>
+          </w:p>
+        </w:tc>
+        <w:tc>
+          <w:tcPr>
+            <w:tcW w:type="dxa" w:w="1200"/>
+            <w:tcBorders>
+              <w:top w:val="single" w:color="BFBFBF" w:sz="1"/>
+              <w:left w:val="single" w:color="BFBFBF" w:sz="1"/>
+              <w:bottom w:val="single" w:color="BFBFBF" w:sz="1"/>
+              <w:right w:val="single" w:color="BFBFBF" w:sz="1"/>
+            </w:tcBorders>
+            <w:tcMar>
+              <w:top w:type="dxa" w:w="60"/>
+              <w:left w:type="dxa" w:w="110"/>
+              <w:bottom w:type="dxa" w:w="60"/>
+              <w:right w:type="dxa" w:w="110"/>
+            </w:tcMar>
+          </w:tcPr>
+          <w:p>
+            <w:r>
+              <w:rPr>
+                <w:b w:val="false"/>
+                <w:bCs w:val="false"/>
+                <w:sz w:val="20"/>
+                <w:szCs w:val="20"/>
+              </w:rPr>
+              <w:t xml:space="preserve">5.922</w:t>
             </w:r>
           </w:p>
         </w:tc>
@@ -10674,7 +10674,7 @@
       <w:tr>
         <w:tc>
           <w:tcPr>
-            <w:tcW w:type="dxa" w:w="1560"/>
+            <w:tcW w:type="dxa" w:w="1500"/>
             <w:tcBorders>
               <w:top w:val="single" w:color="BFBFBF" w:sz="1"/>
               <w:left w:val="single" w:color="BFBFBF" w:sz="1"/>
@@ -10703,93 +10703,6 @@
         </w:tc>
         <w:tc>
           <w:tcPr>
-            <w:tcW w:type="dxa" w:w="1140"/>
-            <w:tcBorders>
-              <w:top w:val="single" w:color="BFBFBF" w:sz="1"/>
-              <w:left w:val="single" w:color="BFBFBF" w:sz="1"/>
-              <w:bottom w:val="single" w:color="BFBFBF" w:sz="1"/>
-              <w:right w:val="single" w:color="BFBFBF" w:sz="1"/>
-            </w:tcBorders>
-            <w:shd w:fill="F3F6FB" w:val="clear"/>
-            <w:tcMar>
-              <w:top w:type="dxa" w:w="60"/>
-              <w:left w:type="dxa" w:w="110"/>
-              <w:bottom w:type="dxa" w:w="60"/>
-              <w:right w:type="dxa" w:w="110"/>
-            </w:tcMar>
-          </w:tcPr>
-          <w:p>
-            <w:r>
-              <w:rPr>
-                <w:b w:val="false"/>
-                <w:bCs w:val="false"/>
-                <w:sz w:val="20"/>
-                <w:szCs w:val="20"/>
-              </w:rPr>
-              <w:t xml:space="preserve">—</w:t>
-            </w:r>
-          </w:p>
-        </w:tc>
-        <w:tc>
-          <w:tcPr>
-            <w:tcW w:type="dxa" w:w="1140"/>
-            <w:tcBorders>
-              <w:top w:val="single" w:color="BFBFBF" w:sz="1"/>
-              <w:left w:val="single" w:color="BFBFBF" w:sz="1"/>
-              <w:bottom w:val="single" w:color="BFBFBF" w:sz="1"/>
-              <w:right w:val="single" w:color="BFBFBF" w:sz="1"/>
-            </w:tcBorders>
-            <w:shd w:fill="F3F6FB" w:val="clear"/>
-            <w:tcMar>
-              <w:top w:type="dxa" w:w="60"/>
-              <w:left w:type="dxa" w:w="110"/>
-              <w:bottom w:type="dxa" w:w="60"/>
-              <w:right w:type="dxa" w:w="110"/>
-            </w:tcMar>
-          </w:tcPr>
-          <w:p>
-            <w:r>
-              <w:rPr>
-                <w:b w:val="false"/>
-                <w:bCs w:val="false"/>
-                <w:sz w:val="20"/>
-                <w:szCs w:val="20"/>
-              </w:rPr>
-              <w:t xml:space="preserve">+2.297</w:t>
-            </w:r>
-          </w:p>
-        </w:tc>
-        <w:tc>
-          <w:tcPr>
-            <w:tcW w:type="dxa" w:w="1140"/>
-            <w:tcBorders>
-              <w:top w:val="single" w:color="BFBFBF" w:sz="1"/>
-              <w:left w:val="single" w:color="BFBFBF" w:sz="1"/>
-              <w:bottom w:val="single" w:color="BFBFBF" w:sz="1"/>
-              <w:right w:val="single" w:color="BFBFBF" w:sz="1"/>
-            </w:tcBorders>
-            <w:shd w:fill="F3F6FB" w:val="clear"/>
-            <w:tcMar>
-              <w:top w:type="dxa" w:w="60"/>
-              <w:left w:type="dxa" w:w="110"/>
-              <w:bottom w:type="dxa" w:w="60"/>
-              <w:right w:type="dxa" w:w="110"/>
-            </w:tcMar>
-          </w:tcPr>
-          <w:p>
-            <w:r>
-              <w:rPr>
-                <w:b w:val="false"/>
-                <w:bCs w:val="false"/>
-                <w:sz w:val="20"/>
-                <w:szCs w:val="20"/>
-              </w:rPr>
-              <w:t xml:space="preserve">—</w:t>
-            </w:r>
-          </w:p>
-        </w:tc>
-        <w:tc>
-          <w:tcPr>
             <w:tcW w:type="dxa" w:w="1080"/>
             <w:tcBorders>
               <w:top w:val="single" w:color="BFBFBF" w:sz="1"/>
@@ -10813,7 +10726,7 @@
                 <w:sz w:val="20"/>
                 <w:szCs w:val="20"/>
               </w:rPr>
-              <w:t xml:space="preserve">−0.233</w:t>
+              <w:t xml:space="preserve">+0.992</w:t>
             </w:r>
           </w:p>
         </w:tc>
@@ -10842,36 +10755,7 @@
                 <w:sz w:val="20"/>
                 <w:szCs w:val="20"/>
               </w:rPr>
-              <w:t xml:space="preserve">+4.277</w:t>
-            </w:r>
-          </w:p>
-        </w:tc>
-        <w:tc>
-          <w:tcPr>
-            <w:tcW w:type="dxa" w:w="1140"/>
-            <w:tcBorders>
-              <w:top w:val="single" w:color="BFBFBF" w:sz="1"/>
-              <w:left w:val="single" w:color="BFBFBF" w:sz="1"/>
-              <w:bottom w:val="single" w:color="BFBFBF" w:sz="1"/>
-              <w:right w:val="single" w:color="BFBFBF" w:sz="1"/>
-            </w:tcBorders>
-            <w:shd w:fill="F3F6FB" w:val="clear"/>
-            <w:tcMar>
-              <w:top w:type="dxa" w:w="60"/>
-              <w:left w:type="dxa" w:w="110"/>
-              <w:bottom w:type="dxa" w:w="60"/>
-              <w:right w:type="dxa" w:w="110"/>
-            </w:tcMar>
-          </w:tcPr>
-          <w:p>
-            <w:r>
-              <w:rPr>
-                <w:b w:val="false"/>
-                <w:bCs w:val="false"/>
-                <w:sz w:val="20"/>
-                <w:szCs w:val="20"/>
-              </w:rPr>
-              <w:t xml:space="preserve">7.844</w:t>
+              <w:t xml:space="preserve">+2.317</w:t>
             </w:r>
           </w:p>
         </w:tc>
@@ -10900,7 +10784,123 @@
                 <w:sz w:val="20"/>
                 <w:szCs w:val="20"/>
               </w:rPr>
-              <w:t xml:space="preserve">0.022</w:t>
+              <w:t xml:space="preserve">+3.738</w:t>
+            </w:r>
+          </w:p>
+        </w:tc>
+        <w:tc>
+          <w:tcPr>
+            <w:tcW w:type="dxa" w:w="1080"/>
+            <w:tcBorders>
+              <w:top w:val="single" w:color="BFBFBF" w:sz="1"/>
+              <w:left w:val="single" w:color="BFBFBF" w:sz="1"/>
+              <w:bottom w:val="single" w:color="BFBFBF" w:sz="1"/>
+              <w:right w:val="single" w:color="BFBFBF" w:sz="1"/>
+            </w:tcBorders>
+            <w:shd w:fill="F3F6FB" w:val="clear"/>
+            <w:tcMar>
+              <w:top w:type="dxa" w:w="60"/>
+              <w:left w:type="dxa" w:w="110"/>
+              <w:bottom w:type="dxa" w:w="60"/>
+              <w:right w:type="dxa" w:w="110"/>
+            </w:tcMar>
+          </w:tcPr>
+          <w:p>
+            <w:r>
+              <w:rPr>
+                <w:b w:val="false"/>
+                <w:bCs w:val="false"/>
+                <w:sz w:val="20"/>
+                <w:szCs w:val="20"/>
+              </w:rPr>
+              <w:t xml:space="preserve">−0.236</w:t>
+            </w:r>
+          </w:p>
+        </w:tc>
+        <w:tc>
+          <w:tcPr>
+            <w:tcW w:type="dxa" w:w="1080"/>
+            <w:tcBorders>
+              <w:top w:val="single" w:color="BFBFBF" w:sz="1"/>
+              <w:left w:val="single" w:color="BFBFBF" w:sz="1"/>
+              <w:bottom w:val="single" w:color="BFBFBF" w:sz="1"/>
+              <w:right w:val="single" w:color="BFBFBF" w:sz="1"/>
+            </w:tcBorders>
+            <w:shd w:fill="F3F6FB" w:val="clear"/>
+            <w:tcMar>
+              <w:top w:type="dxa" w:w="60"/>
+              <w:left w:type="dxa" w:w="110"/>
+              <w:bottom w:type="dxa" w:w="60"/>
+              <w:right w:type="dxa" w:w="110"/>
+            </w:tcMar>
+          </w:tcPr>
+          <w:p>
+            <w:r>
+              <w:rPr>
+                <w:b w:val="false"/>
+                <w:bCs w:val="false"/>
+                <w:sz w:val="20"/>
+                <w:szCs w:val="20"/>
+              </w:rPr>
+              <w:t xml:space="preserve">+4.202</w:t>
+            </w:r>
+          </w:p>
+        </w:tc>
+        <w:tc>
+          <w:tcPr>
+            <w:tcW w:type="dxa" w:w="1200"/>
+            <w:tcBorders>
+              <w:top w:val="single" w:color="BFBFBF" w:sz="1"/>
+              <w:left w:val="single" w:color="BFBFBF" w:sz="1"/>
+              <w:bottom w:val="single" w:color="BFBFBF" w:sz="1"/>
+              <w:right w:val="single" w:color="BFBFBF" w:sz="1"/>
+            </w:tcBorders>
+            <w:shd w:fill="F3F6FB" w:val="clear"/>
+            <w:tcMar>
+              <w:top w:type="dxa" w:w="60"/>
+              <w:left w:type="dxa" w:w="110"/>
+              <w:bottom w:type="dxa" w:w="60"/>
+              <w:right w:type="dxa" w:w="110"/>
+            </w:tcMar>
+          </w:tcPr>
+          <w:p>
+            <w:r>
+              <w:rPr>
+                <w:b w:val="false"/>
+                <w:bCs w:val="false"/>
+                <w:sz w:val="20"/>
+                <w:szCs w:val="20"/>
+              </w:rPr>
+              <w:t xml:space="preserve">6.578</w:t>
+            </w:r>
+          </w:p>
+        </w:tc>
+        <w:tc>
+          <w:tcPr>
+            <w:tcW w:type="dxa" w:w="1080"/>
+            <w:tcBorders>
+              <w:top w:val="single" w:color="BFBFBF" w:sz="1"/>
+              <w:left w:val="single" w:color="BFBFBF" w:sz="1"/>
+              <w:bottom w:val="single" w:color="BFBFBF" w:sz="1"/>
+              <w:right w:val="single" w:color="BFBFBF" w:sz="1"/>
+            </w:tcBorders>
+            <w:shd w:fill="F3F6FB" w:val="clear"/>
+            <w:tcMar>
+              <w:top w:type="dxa" w:w="60"/>
+              <w:left w:type="dxa" w:w="110"/>
+              <w:bottom w:type="dxa" w:w="60"/>
+              <w:right w:type="dxa" w:w="110"/>
+            </w:tcMar>
+          </w:tcPr>
+          <w:p>
+            <w:r>
+              <w:rPr>
+                <w:b w:val="false"/>
+                <w:bCs w:val="false"/>
+                <w:sz w:val="20"/>
+                <w:szCs w:val="20"/>
+              </w:rPr>
+              <w:t xml:space="preserve">0.023</w:t>
             </w:r>
           </w:p>
         </w:tc>
@@ -10908,7 +10908,7 @@
       <w:tr>
         <w:tc>
           <w:tcPr>
-            <w:tcW w:type="dxa" w:w="1560"/>
+            <w:tcW w:type="dxa" w:w="1500"/>
             <w:tcBorders>
               <w:top w:val="single" w:color="BFBFBF" w:sz="1"/>
               <w:left w:val="single" w:color="BFBFBF" w:sz="1"/>
@@ -10936,90 +10936,6 @@
         </w:tc>
         <w:tc>
           <w:tcPr>
-            <w:tcW w:type="dxa" w:w="1140"/>
-            <w:tcBorders>
-              <w:top w:val="single" w:color="BFBFBF" w:sz="1"/>
-              <w:left w:val="single" w:color="BFBFBF" w:sz="1"/>
-              <w:bottom w:val="single" w:color="BFBFBF" w:sz="1"/>
-              <w:right w:val="single" w:color="BFBFBF" w:sz="1"/>
-            </w:tcBorders>
-            <w:tcMar>
-              <w:top w:type="dxa" w:w="60"/>
-              <w:left w:type="dxa" w:w="110"/>
-              <w:bottom w:type="dxa" w:w="60"/>
-              <w:right w:type="dxa" w:w="110"/>
-            </w:tcMar>
-          </w:tcPr>
-          <w:p>
-            <w:r>
-              <w:rPr>
-                <w:b w:val="false"/>
-                <w:bCs w:val="false"/>
-                <w:sz w:val="20"/>
-                <w:szCs w:val="20"/>
-              </w:rPr>
-              <w:t xml:space="preserve">—</w:t>
-            </w:r>
-          </w:p>
-        </w:tc>
-        <w:tc>
-          <w:tcPr>
-            <w:tcW w:type="dxa" w:w="1140"/>
-            <w:tcBorders>
-              <w:top w:val="single" w:color="BFBFBF" w:sz="1"/>
-              <w:left w:val="single" w:color="BFBFBF" w:sz="1"/>
-              <w:bottom w:val="single" w:color="BFBFBF" w:sz="1"/>
-              <w:right w:val="single" w:color="BFBFBF" w:sz="1"/>
-            </w:tcBorders>
-            <w:tcMar>
-              <w:top w:type="dxa" w:w="60"/>
-              <w:left w:type="dxa" w:w="110"/>
-              <w:bottom w:type="dxa" w:w="60"/>
-              <w:right w:type="dxa" w:w="110"/>
-            </w:tcMar>
-          </w:tcPr>
-          <w:p>
-            <w:r>
-              <w:rPr>
-                <w:b w:val="false"/>
-                <w:bCs w:val="false"/>
-                <w:sz w:val="20"/>
-                <w:szCs w:val="20"/>
-              </w:rPr>
-              <w:t xml:space="preserve">+1.602</w:t>
-            </w:r>
-          </w:p>
-        </w:tc>
-        <w:tc>
-          <w:tcPr>
-            <w:tcW w:type="dxa" w:w="1140"/>
-            <w:tcBorders>
-              <w:top w:val="single" w:color="BFBFBF" w:sz="1"/>
-              <w:left w:val="single" w:color="BFBFBF" w:sz="1"/>
-              <w:bottom w:val="single" w:color="BFBFBF" w:sz="1"/>
-              <w:right w:val="single" w:color="BFBFBF" w:sz="1"/>
-            </w:tcBorders>
-            <w:tcMar>
-              <w:top w:type="dxa" w:w="60"/>
-              <w:left w:type="dxa" w:w="110"/>
-              <w:bottom w:type="dxa" w:w="60"/>
-              <w:right w:type="dxa" w:w="110"/>
-            </w:tcMar>
-          </w:tcPr>
-          <w:p>
-            <w:r>
-              <w:rPr>
-                <w:b w:val="false"/>
-                <w:bCs w:val="false"/>
-                <w:sz w:val="20"/>
-                <w:szCs w:val="20"/>
-              </w:rPr>
-              <w:t xml:space="preserve">—</w:t>
-            </w:r>
-          </w:p>
-        </w:tc>
-        <w:tc>
-          <w:tcPr>
             <w:tcW w:type="dxa" w:w="1080"/>
             <w:tcBorders>
               <w:top w:val="single" w:color="BFBFBF" w:sz="1"/>
@@ -11042,7 +10958,7 @@
                 <w:sz w:val="20"/>
                 <w:szCs w:val="20"/>
               </w:rPr>
-              <w:t xml:space="preserve">−0.357</w:t>
+              <w:t xml:space="preserve">+0.687</w:t>
             </w:r>
           </w:p>
         </w:tc>
@@ -11070,35 +10986,7 @@
                 <w:sz w:val="20"/>
                 <w:szCs w:val="20"/>
               </w:rPr>
-              <w:t xml:space="preserve">+2.019</w:t>
-            </w:r>
-          </w:p>
-        </w:tc>
-        <w:tc>
-          <w:tcPr>
-            <w:tcW w:type="dxa" w:w="1140"/>
-            <w:tcBorders>
-              <w:top w:val="single" w:color="BFBFBF" w:sz="1"/>
-              <w:left w:val="single" w:color="BFBFBF" w:sz="1"/>
-              <w:bottom w:val="single" w:color="BFBFBF" w:sz="1"/>
-              <w:right w:val="single" w:color="BFBFBF" w:sz="1"/>
-            </w:tcBorders>
-            <w:tcMar>
-              <w:top w:type="dxa" w:w="60"/>
-              <w:left w:type="dxa" w:w="110"/>
-              <w:bottom w:type="dxa" w:w="60"/>
-              <w:right w:type="dxa" w:w="110"/>
-            </w:tcMar>
-          </w:tcPr>
-          <w:p>
-            <w:r>
-              <w:rPr>
-                <w:b w:val="false"/>
-                <w:bCs w:val="false"/>
-                <w:sz w:val="20"/>
-                <w:szCs w:val="20"/>
-              </w:rPr>
-              <w:t xml:space="preserve">5.034</w:t>
+              <w:t xml:space="preserve">+1.539</w:t>
             </w:r>
           </w:p>
         </w:tc>
@@ -11126,7 +11014,119 @@
                 <w:sz w:val="20"/>
                 <w:szCs w:val="20"/>
               </w:rPr>
-              <w:t xml:space="preserve">0.163</w:t>
+              <w:t xml:space="preserve">+2.335</w:t>
+            </w:r>
+          </w:p>
+        </w:tc>
+        <w:tc>
+          <w:tcPr>
+            <w:tcW w:type="dxa" w:w="1080"/>
+            <w:tcBorders>
+              <w:top w:val="single" w:color="BFBFBF" w:sz="1"/>
+              <w:left w:val="single" w:color="BFBFBF" w:sz="1"/>
+              <w:bottom w:val="single" w:color="BFBFBF" w:sz="1"/>
+              <w:right w:val="single" w:color="BFBFBF" w:sz="1"/>
+            </w:tcBorders>
+            <w:tcMar>
+              <w:top w:type="dxa" w:w="60"/>
+              <w:left w:type="dxa" w:w="110"/>
+              <w:bottom w:type="dxa" w:w="60"/>
+              <w:right w:type="dxa" w:w="110"/>
+            </w:tcMar>
+          </w:tcPr>
+          <w:p>
+            <w:r>
+              <w:rPr>
+                <w:b w:val="false"/>
+                <w:bCs w:val="false"/>
+                <w:sz w:val="20"/>
+                <w:szCs w:val="20"/>
+              </w:rPr>
+              <w:t xml:space="preserve">−0.360</w:t>
+            </w:r>
+          </w:p>
+        </w:tc>
+        <w:tc>
+          <w:tcPr>
+            <w:tcW w:type="dxa" w:w="1080"/>
+            <w:tcBorders>
+              <w:top w:val="single" w:color="BFBFBF" w:sz="1"/>
+              <w:left w:val="single" w:color="BFBFBF" w:sz="1"/>
+              <w:bottom w:val="single" w:color="BFBFBF" w:sz="1"/>
+              <w:right w:val="single" w:color="BFBFBF" w:sz="1"/>
+            </w:tcBorders>
+            <w:tcMar>
+              <w:top w:type="dxa" w:w="60"/>
+              <w:left w:type="dxa" w:w="110"/>
+              <w:bottom w:type="dxa" w:w="60"/>
+              <w:right w:type="dxa" w:w="110"/>
+            </w:tcMar>
+          </w:tcPr>
+          <w:p>
+            <w:r>
+              <w:rPr>
+                <w:b w:val="false"/>
+                <w:bCs w:val="false"/>
+                <w:sz w:val="20"/>
+                <w:szCs w:val="20"/>
+              </w:rPr>
+              <w:t xml:space="preserve">+1.910</w:t>
+            </w:r>
+          </w:p>
+        </w:tc>
+        <w:tc>
+          <w:tcPr>
+            <w:tcW w:type="dxa" w:w="1200"/>
+            <w:tcBorders>
+              <w:top w:val="single" w:color="BFBFBF" w:sz="1"/>
+              <w:left w:val="single" w:color="BFBFBF" w:sz="1"/>
+              <w:bottom w:val="single" w:color="BFBFBF" w:sz="1"/>
+              <w:right w:val="single" w:color="BFBFBF" w:sz="1"/>
+            </w:tcBorders>
+            <w:tcMar>
+              <w:top w:type="dxa" w:w="60"/>
+              <w:left w:type="dxa" w:w="110"/>
+              <w:bottom w:type="dxa" w:w="60"/>
+              <w:right w:type="dxa" w:w="110"/>
+            </w:tcMar>
+          </w:tcPr>
+          <w:p>
+            <w:r>
+              <w:rPr>
+                <w:b w:val="false"/>
+                <w:bCs w:val="false"/>
+                <w:sz w:val="20"/>
+                <w:szCs w:val="20"/>
+              </w:rPr>
+              <w:t xml:space="preserve">4.175</w:t>
+            </w:r>
+          </w:p>
+        </w:tc>
+        <w:tc>
+          <w:tcPr>
+            <w:tcW w:type="dxa" w:w="1080"/>
+            <w:tcBorders>
+              <w:top w:val="single" w:color="BFBFBF" w:sz="1"/>
+              <w:left w:val="single" w:color="BFBFBF" w:sz="1"/>
+              <w:bottom w:val="single" w:color="BFBFBF" w:sz="1"/>
+              <w:right w:val="single" w:color="BFBFBF" w:sz="1"/>
+            </w:tcBorders>
+            <w:tcMar>
+              <w:top w:type="dxa" w:w="60"/>
+              <w:left w:type="dxa" w:w="110"/>
+              <w:bottom w:type="dxa" w:w="60"/>
+              <w:right w:type="dxa" w:w="110"/>
+            </w:tcMar>
+          </w:tcPr>
+          <w:p>
+            <w:r>
+              <w:rPr>
+                <w:b w:val="false"/>
+                <w:bCs w:val="false"/>
+                <w:sz w:val="20"/>
+                <w:szCs w:val="20"/>
+              </w:rPr>
+              <w:t xml:space="preserve">0.165</w:t>
             </w:r>
           </w:p>
         </w:tc>
@@ -11134,7 +11134,7 @@
       <w:tr>
         <w:tc>
           <w:tcPr>
-            <w:tcW w:type="dxa" w:w="1560"/>
+            <w:tcW w:type="dxa" w:w="1500"/>
             <w:tcBorders>
               <w:top w:val="single" w:color="BFBFBF" w:sz="1"/>
               <w:left w:val="single" w:color="BFBFBF" w:sz="1"/>
@@ -11163,7 +11163,94 @@
         </w:tc>
         <w:tc>
           <w:tcPr>
-            <w:tcW w:type="dxa" w:w="1140"/>
+            <w:tcW w:type="dxa" w:w="1080"/>
+            <w:tcBorders>
+              <w:top w:val="single" w:color="BFBFBF" w:sz="1"/>
+              <w:left w:val="single" w:color="BFBFBF" w:sz="1"/>
+              <w:bottom w:val="single" w:color="BFBFBF" w:sz="1"/>
+              <w:right w:val="single" w:color="BFBFBF" w:sz="1"/>
+            </w:tcBorders>
+            <w:shd w:fill="F3F6FB" w:val="clear"/>
+            <w:tcMar>
+              <w:top w:type="dxa" w:w="60"/>
+              <w:left w:type="dxa" w:w="110"/>
+              <w:bottom w:type="dxa" w:w="60"/>
+              <w:right w:type="dxa" w:w="110"/>
+            </w:tcMar>
+          </w:tcPr>
+          <w:p>
+            <w:r>
+              <w:rPr>
+                <w:b w:val="false"/>
+                <w:bCs w:val="false"/>
+                <w:sz w:val="20"/>
+                <w:szCs w:val="20"/>
+              </w:rPr>
+              <w:t xml:space="preserve">+0.399</w:t>
+            </w:r>
+          </w:p>
+        </w:tc>
+        <w:tc>
+          <w:tcPr>
+            <w:tcW w:type="dxa" w:w="1080"/>
+            <w:tcBorders>
+              <w:top w:val="single" w:color="BFBFBF" w:sz="1"/>
+              <w:left w:val="single" w:color="BFBFBF" w:sz="1"/>
+              <w:bottom w:val="single" w:color="BFBFBF" w:sz="1"/>
+              <w:right w:val="single" w:color="BFBFBF" w:sz="1"/>
+            </w:tcBorders>
+            <w:shd w:fill="F3F6FB" w:val="clear"/>
+            <w:tcMar>
+              <w:top w:type="dxa" w:w="60"/>
+              <w:left w:type="dxa" w:w="110"/>
+              <w:bottom w:type="dxa" w:w="60"/>
+              <w:right w:type="dxa" w:w="110"/>
+            </w:tcMar>
+          </w:tcPr>
+          <w:p>
+            <w:r>
+              <w:rPr>
+                <w:b w:val="false"/>
+                <w:bCs w:val="false"/>
+                <w:sz w:val="20"/>
+                <w:szCs w:val="20"/>
+              </w:rPr>
+              <w:t xml:space="preserve">— (NaN)</w:t>
+            </w:r>
+          </w:p>
+        </w:tc>
+        <w:tc>
+          <w:tcPr>
+            <w:tcW w:type="dxa" w:w="1080"/>
+            <w:tcBorders>
+              <w:top w:val="single" w:color="BFBFBF" w:sz="1"/>
+              <w:left w:val="single" w:color="BFBFBF" w:sz="1"/>
+              <w:bottom w:val="single" w:color="BFBFBF" w:sz="1"/>
+              <w:right w:val="single" w:color="BFBFBF" w:sz="1"/>
+            </w:tcBorders>
+            <w:shd w:fill="F3F6FB" w:val="clear"/>
+            <w:tcMar>
+              <w:top w:type="dxa" w:w="60"/>
+              <w:left w:type="dxa" w:w="110"/>
+              <w:bottom w:type="dxa" w:w="60"/>
+              <w:right w:type="dxa" w:w="110"/>
+            </w:tcMar>
+          </w:tcPr>
+          <w:p>
+            <w:r>
+              <w:rPr>
+                <w:b w:val="false"/>
+                <w:bCs w:val="false"/>
+                <w:sz w:val="20"/>
+                <w:szCs w:val="20"/>
+              </w:rPr>
+              <w:t xml:space="preserve">—</w:t>
+            </w:r>
+          </w:p>
+        </w:tc>
+        <w:tc>
+          <w:tcPr>
+            <w:tcW w:type="dxa" w:w="1080"/>
             <w:tcBorders>
               <w:top w:val="single" w:color="BFBFBF" w:sz="1"/>
               <w:left w:val="single" w:color="BFBFBF" w:sz="1"/>
@@ -11192,36 +11279,7 @@
         </w:tc>
         <w:tc>
           <w:tcPr>
-            <w:tcW w:type="dxa" w:w="1140"/>
-            <w:tcBorders>
-              <w:top w:val="single" w:color="BFBFBF" w:sz="1"/>
-              <w:left w:val="single" w:color="BFBFBF" w:sz="1"/>
-              <w:bottom w:val="single" w:color="BFBFBF" w:sz="1"/>
-              <w:right w:val="single" w:color="BFBFBF" w:sz="1"/>
-            </w:tcBorders>
-            <w:shd w:fill="F3F6FB" w:val="clear"/>
-            <w:tcMar>
-              <w:top w:type="dxa" w:w="60"/>
-              <w:left w:type="dxa" w:w="110"/>
-              <w:bottom w:type="dxa" w:w="60"/>
-              <w:right w:type="dxa" w:w="110"/>
-            </w:tcMar>
-          </w:tcPr>
-          <w:p>
-            <w:r>
-              <w:rPr>
-                <w:b w:val="false"/>
-                <w:bCs w:val="false"/>
-                <w:sz w:val="20"/>
-                <w:szCs w:val="20"/>
-              </w:rPr>
-              <w:t xml:space="preserve">0.000</w:t>
-            </w:r>
-          </w:p>
-        </w:tc>
-        <w:tc>
-          <w:tcPr>
-            <w:tcW w:type="dxa" w:w="1140"/>
+            <w:tcW w:type="dxa" w:w="1080"/>
             <w:tcBorders>
               <w:top w:val="single" w:color="BFBFBF" w:sz="1"/>
               <w:left w:val="single" w:color="BFBFBF" w:sz="1"/>
@@ -11250,88 +11308,30 @@
         </w:tc>
         <w:tc>
           <w:tcPr>
-            <w:tcW w:type="dxa" w:w="1080"/>
-            <w:tcBorders>
-              <w:top w:val="single" w:color="BFBFBF" w:sz="1"/>
-              <w:left w:val="single" w:color="BFBFBF" w:sz="1"/>
-              <w:bottom w:val="single" w:color="BFBFBF" w:sz="1"/>
-              <w:right w:val="single" w:color="BFBFBF" w:sz="1"/>
-            </w:tcBorders>
-            <w:shd w:fill="F3F6FB" w:val="clear"/>
-            <w:tcMar>
-              <w:top w:type="dxa" w:w="60"/>
-              <w:left w:type="dxa" w:w="110"/>
-              <w:bottom w:type="dxa" w:w="60"/>
-              <w:right w:type="dxa" w:w="110"/>
-            </w:tcMar>
-          </w:tcPr>
-          <w:p>
-            <w:r>
-              <w:rPr>
-                <w:b w:val="false"/>
-                <w:bCs w:val="false"/>
-                <w:sz w:val="20"/>
-                <w:szCs w:val="20"/>
-              </w:rPr>
-              <w:t xml:space="preserve">0.000</w:t>
-            </w:r>
-          </w:p>
-        </w:tc>
-        <w:tc>
-          <w:tcPr>
-            <w:tcW w:type="dxa" w:w="1080"/>
-            <w:tcBorders>
-              <w:top w:val="single" w:color="BFBFBF" w:sz="1"/>
-              <w:left w:val="single" w:color="BFBFBF" w:sz="1"/>
-              <w:bottom w:val="single" w:color="BFBFBF" w:sz="1"/>
-              <w:right w:val="single" w:color="BFBFBF" w:sz="1"/>
-            </w:tcBorders>
-            <w:shd w:fill="F3F6FB" w:val="clear"/>
-            <w:tcMar>
-              <w:top w:type="dxa" w:w="60"/>
-              <w:left w:type="dxa" w:w="110"/>
-              <w:bottom w:type="dxa" w:w="60"/>
-              <w:right w:type="dxa" w:w="110"/>
-            </w:tcMar>
-          </w:tcPr>
-          <w:p>
-            <w:r>
-              <w:rPr>
-                <w:b w:val="false"/>
-                <w:bCs w:val="false"/>
-                <w:sz w:val="20"/>
-                <w:szCs w:val="20"/>
-              </w:rPr>
-              <w:t xml:space="preserve">—</w:t>
-            </w:r>
-          </w:p>
-        </w:tc>
-        <w:tc>
-          <w:tcPr>
-            <w:tcW w:type="dxa" w:w="1140"/>
-            <w:tcBorders>
-              <w:top w:val="single" w:color="BFBFBF" w:sz="1"/>
-              <w:left w:val="single" w:color="BFBFBF" w:sz="1"/>
-              <w:bottom w:val="single" w:color="BFBFBF" w:sz="1"/>
-              <w:right w:val="single" w:color="BFBFBF" w:sz="1"/>
-            </w:tcBorders>
-            <w:shd w:fill="F3F6FB" w:val="clear"/>
-            <w:tcMar>
-              <w:top w:type="dxa" w:w="60"/>
-              <w:left w:type="dxa" w:w="110"/>
-              <w:bottom w:type="dxa" w:w="60"/>
-              <w:right w:type="dxa" w:w="110"/>
-            </w:tcMar>
-          </w:tcPr>
-          <w:p>
-            <w:r>
-              <w:rPr>
-                <w:b w:val="false"/>
-                <w:bCs w:val="false"/>
-                <w:sz w:val="20"/>
-                <w:szCs w:val="20"/>
-              </w:rPr>
-              <w:t xml:space="preserve">1.000</w:t>
+            <w:tcW w:type="dxa" w:w="1200"/>
+            <w:tcBorders>
+              <w:top w:val="single" w:color="BFBFBF" w:sz="1"/>
+              <w:left w:val="single" w:color="BFBFBF" w:sz="1"/>
+              <w:bottom w:val="single" w:color="BFBFBF" w:sz="1"/>
+              <w:right w:val="single" w:color="BFBFBF" w:sz="1"/>
+            </w:tcBorders>
+            <w:shd w:fill="F3F6FB" w:val="clear"/>
+            <w:tcMar>
+              <w:top w:type="dxa" w:w="60"/>
+              <w:left w:type="dxa" w:w="110"/>
+              <w:bottom w:type="dxa" w:w="60"/>
+              <w:right w:type="dxa" w:w="110"/>
+            </w:tcMar>
+          </w:tcPr>
+          <w:p>
+            <w:r>
+              <w:rPr>
+                <w:b w:val="false"/>
+                <w:bCs w:val="false"/>
+                <w:sz w:val="20"/>
+                <w:szCs w:val="20"/>
+              </w:rPr>
+              <w:t xml:space="preserve">2.506</w:t>
             </w:r>
           </w:p>
         </w:tc>
@@ -11376,10 +11376,10 @@
           <w:b/>
           <w:bCs/>
         </w:rPr>
-        <w:t xml:space="preserve">Okuma: </w:t>
-      </w:r>
-      <w:r>
-        <w:t xml:space="preserve">Risk-ayarlı en iyi strateji MinVariance'tır (Sharpe 2.30, Calmar 4.28, MaxDD −0.23) ve tüm RL ajanlarını her metrikte geçer. En iyi RL ajanı SAC (Sharpe 2.10), naif eşit-ağırlıkla (2.08) başa baştır ama klasik risk-bazlı optimize edicilerin (MinVar/InvVol/RP) gerisindedir. SAC'ın tek belirgin üstünlüğü en düşük turnover'dır (0.011). DQN kârlı ama zayıf ve kararsızdır (bkz. §8.5).</w:t>
+        <w:t xml:space="preserve">Okuma (adil V11): </w:t>
+      </w:r>
+      <w:r>
+        <w:t xml:space="preserve">Risk-ayarlı en iyi MinVariance (Sharpe 2.317). En iyi RL TD3 (2.151) ≈ SAC (2.141) artık InverseVol (2.162) / RiskParity (2.135) DÜZEYİNDE — naif eşit-ağırlığı (2.090) ve risksiz faiz hurdle'ını (CashRiskFree NAV 2.506) GEÇER; MinVariance hâlâ önde ama makas KAPANDI. Mutlak NAV'da RL hafif geride (SAC 5.595 vs BuyHold 5.751). SAC en düşük turnover (0.011). DQN zayıf + kararsız (§8.5). CashRiskFree zero-vol → Sharpe tanımsız (NaN).</w:t>
       </w:r>
     </w:p>
     <w:p>
@@ -12655,7 +12655,7 @@
           <w:iCs/>
           <w:color w:val="555555"/>
         </w:rPr>
-        <w:t xml:space="preserve">TARİHSEL ARŞİV: Aşağıdaki tablo eski golden snapshot'larından (v5/v6/v7) gelir ve geliştirme döngüsünün YÖNÜNÜ gösterir. Geçerli, reprodüklenebilir sonuçlar §8.1'dedir. Reprodüksiyon düzeltmesi + çoklu-tohum analizi (§8.5), DQN'in patolojik kararsız olduğunu (varyasyon katsayısı ~%47) gösterir — yani bu tarihsel değerler tek-gerçekleşmelerdir, kararlı bir eğilim değil.</w:t>
+        <w:t xml:space="preserve">TARİHSEL ARŞİV: Aşağıdaki tablo eski golden snapshot'larından (v5/v6/v7) gelir ve geliştirme döngüsünün YÖNÜNÜ gösterir. Geçerli, adil (V11) sonuçlar §8.1'dedir. Çoklu-tohum analizi (§8.5), DQN'in patolojik kararsız olduğunu (varyasyon katsayısı ~%45) gösterir — yani bu tarihsel değerler tek-gerçekleşmelerdir, kararlı bir eğilim değil.</w:t>
       </w:r>
     </w:p>
     <w:tbl>
@@ -13692,7 +13692,7 @@
                 <w:sz w:val="20"/>
                 <w:szCs w:val="20"/>
               </w:rPr>
-              <w:t xml:space="preserve">0.461 ± 0.218</w:t>
+              <w:t xml:space="preserve">0.903 ± 0.408</w:t>
             </w:r>
           </w:p>
         </w:tc>
@@ -13720,7 +13720,7 @@
                 <w:sz w:val="20"/>
                 <w:szCs w:val="20"/>
               </w:rPr>
-              <w:t xml:space="preserve">1.368 ± 0.362</w:t>
+              <w:t xml:space="preserve">2.204 ± 0.908</w:t>
             </w:r>
           </w:p>
         </w:tc>
@@ -13748,7 +13748,7 @@
                 <w:sz w:val="20"/>
                 <w:szCs w:val="20"/>
               </w:rPr>
-              <w:t xml:space="preserve">0.115 ± 0.101</w:t>
+              <w:t xml:space="preserve">0.316 ± 0.191</w:t>
             </w:r>
           </w:p>
         </w:tc>
@@ -13776,7 +13776,7 @@
                 <w:sz w:val="20"/>
                 <w:szCs w:val="20"/>
               </w:rPr>
-              <w:t xml:space="preserve">−0.443 ± 0.088</w:t>
+              <w:t xml:space="preserve">−0.410 ± 0.072</w:t>
             </w:r>
           </w:p>
         </w:tc>
@@ -13836,7 +13836,7 @@
                 <w:sz w:val="20"/>
                 <w:szCs w:val="20"/>
               </w:rPr>
-              <w:t xml:space="preserve">1.708 ± 0.052</w:t>
+              <w:t xml:space="preserve">2.045 ± 0.044</w:t>
             </w:r>
           </w:p>
         </w:tc>
@@ -13865,7 +13865,7 @@
                 <w:sz w:val="20"/>
                 <w:szCs w:val="20"/>
               </w:rPr>
-              <w:t xml:space="preserve">3.944 ± 0.134</w:t>
+              <w:t xml:space="preserve">5.284 ± 0.211</w:t>
             </w:r>
           </w:p>
         </w:tc>
@@ -13894,7 +13894,7 @@
                 <w:sz w:val="20"/>
                 <w:szCs w:val="20"/>
               </w:rPr>
-              <w:t xml:space="preserve">0.652 ± 0.020</w:t>
+              <w:t xml:space="preserve">0.838 ± 0.027</w:t>
             </w:r>
           </w:p>
         </w:tc>
@@ -13923,7 +13923,7 @@
                 <w:sz w:val="20"/>
                 <w:szCs w:val="20"/>
               </w:rPr>
-              <w:t xml:space="preserve">−0.276 ± 0.010</w:t>
+              <w:t xml:space="preserve">−0.258 ± 0.007</w:t>
             </w:r>
           </w:p>
         </w:tc>
@@ -13981,7 +13981,7 @@
                 <w:sz w:val="20"/>
                 <w:szCs w:val="20"/>
               </w:rPr>
-              <w:t xml:space="preserve">2.086 ± 0.016</w:t>
+              <w:t xml:space="preserve">2.123 ± 0.017</w:t>
             </w:r>
           </w:p>
         </w:tc>
@@ -14009,7 +14009,7 @@
                 <w:sz w:val="20"/>
                 <w:szCs w:val="20"/>
               </w:rPr>
-              <w:t xml:space="preserve">5.438 ± 0.074</w:t>
+              <w:t xml:space="preserve">5.619 ± 0.079</w:t>
             </w:r>
           </w:p>
         </w:tc>
@@ -14037,7 +14037,7 @@
                 <w:sz w:val="20"/>
                 <w:szCs w:val="20"/>
               </w:rPr>
-              <w:t xml:space="preserve">0.858 ± 0.009</w:t>
+              <w:t xml:space="preserve">0.880 ± 0.010</w:t>
             </w:r>
           </w:p>
         </w:tc>
@@ -14125,7 +14125,7 @@
                 <w:sz w:val="20"/>
                 <w:szCs w:val="20"/>
               </w:rPr>
-              <w:t xml:space="preserve">2.046 ± 0.116</w:t>
+              <w:t xml:space="preserve">2.122 ± 0.125</w:t>
             </w:r>
           </w:p>
         </w:tc>
@@ -14154,7 +14154,7 @@
                 <w:sz w:val="20"/>
                 <w:szCs w:val="20"/>
               </w:rPr>
-              <w:t xml:space="preserve">5.341 ± 0.650</w:t>
+              <w:t xml:space="preserve">5.748 ± 0.575</w:t>
             </w:r>
           </w:p>
         </w:tc>
@@ -14183,7 +14183,7 @@
                 <w:sz w:val="20"/>
                 <w:szCs w:val="20"/>
               </w:rPr>
-              <w:t xml:space="preserve">0.843 ± 0.079</w:t>
+              <w:t xml:space="preserve">0.894 ± 0.072</w:t>
             </w:r>
           </w:p>
         </w:tc>
@@ -14212,7 +14212,7 @@
                 <w:sz w:val="20"/>
                 <w:szCs w:val="20"/>
               </w:rPr>
-              <w:t xml:space="preserve">−0.257 ± 0.008</w:t>
+              <w:t xml:space="preserve">−0.253 ± 0.010</w:t>
             </w:r>
           </w:p>
         </w:tc>
@@ -14231,7 +14231,7 @@
         <w:t xml:space="preserve">Bulgu: </w:t>
       </w:r>
       <w:r>
-        <w:t xml:space="preserve">DQN'in varyasyon katsayısı ~%47 (Sharpe 0.46±0.22) — tek-seed raporlama bilimsel olarak güvenilmez. SAC en stabil ajandır (std ~%1). Algoritma sıralaması SAC≈TD3 &gt; PPO ≫ DQN; standart sapmalar birbirinden ayrıştığı için bu fark istatistiksel olarak anlamlıdır (şans değil). SAC ortalaması (2.09) yine de MinVariance'ı (2.30) geçmez.</w:t>
+        <w:t xml:space="preserve">DQN'in varyasyon katsayısı ~%45 (Sharpe 0.90±0.41; per-seed FinalNAV 1.37/2.47/3.65/1.58/1.96 — kanonik seed=42=1.37 DQN'in DÜŞÜK gerçekleşmesidir!) — tek-seed raporlama bilimsel olarak güvenilmez. SAC en stabil ajandır (CV ~%0.8). Sıralama SAC≈TD3 (~2.12) &gt; PPO (2.05) ≫ DQN; standart sapmalar ayrıştığı için fark istatistiksel olarak anlamlıdır. SAC/TD3 ortalaması (~2.12) yine de MinVariance'ı (2.32) geçmez.</w:t>
       </w:r>
     </w:p>
     <w:p>
@@ -14449,7 +14449,7 @@
                 <w:sz w:val="20"/>
                 <w:szCs w:val="20"/>
               </w:rPr>
-              <w:t xml:space="preserve">0.041</w:t>
+              <w:t xml:space="preserve">0.014</w:t>
             </w:r>
           </w:p>
         </w:tc>
@@ -14538,7 +14538,7 @@
                 <w:sz w:val="20"/>
                 <w:szCs w:val="20"/>
               </w:rPr>
-              <w:t xml:space="preserve">0.011</w:t>
+              <w:t xml:space="preserve">0.016</w:t>
             </w:r>
           </w:p>
         </w:tc>
@@ -14624,7 +14624,7 @@
                 <w:sz w:val="20"/>
                 <w:szCs w:val="20"/>
               </w:rPr>
-              <w:t xml:space="preserve">0.008</w:t>
+              <w:t xml:space="preserve">0.002</w:t>
             </w:r>
           </w:p>
         </w:tc>
@@ -14713,7 +14713,7 @@
                 <w:sz w:val="20"/>
                 <w:szCs w:val="20"/>
               </w:rPr>
-              <w:t xml:space="preserve">0.022</w:t>
+              <w:t xml:space="preserve">0.030</w:t>
             </w:r>
           </w:p>
         </w:tc>
@@ -14799,7 +14799,7 @@
                 <w:sz w:val="20"/>
                 <w:szCs w:val="20"/>
               </w:rPr>
-              <w:t xml:space="preserve">0.007</w:t>
+              <w:t xml:space="preserve">0.009</w:t>
             </w:r>
           </w:p>
         </w:tc>
@@ -14818,7 +14818,7 @@
         <w:t xml:space="preserve">Bulgu: </w:t>
       </w:r>
       <w:r>
-        <w:t xml:space="preserve">Maksimum Sharpe yayılımı 0.041 (&lt;%2). Hiçbir katsayı sonucu belirgin biçimde değiştirmiyor → ödül kırılgan bir tepe noktası değil, geniş bir platodur. Bu, ödülün test'e uyarlanmadığının (no reward hacking / test leakage) nicel kanıtıdır.</w:t>
+        <w:t xml:space="preserve">Maksimum Sharpe yayılımı 0.030 (&lt;%1.5). Hiçbir katsayı sonucu belirgin biçimde değiştirmiyor → ödül kırılgan bir tepe noktası değil, geniş bir platodur. Bu, ödülün ölçüm-dönemine uyarlanmadığının (no reward hacking / test leakage) nicel kanıtıdır.</w:t>
       </w:r>
     </w:p>
     <w:p>
@@ -15485,7 +15485,7 @@
         <w:jc w:val="both"/>
       </w:pPr>
       <w:r>
-        <w:t xml:space="preserve">scripts/cost_sensitivity.py, ödüldeki η·‖Δw‖₁ teriminin gerçekçiliğini ve gerçek maliyet altında net edge'i ölçer. Maliyet modeli (2024-2025 teyitli): aracı komisyonu binde 1-2 = 10-20 bps tek-yön (Garanti BBVA 31.05.2024; İKON Menkul 2025) + BSMV komisyon üzerine %5 + spread/slippage ~2-10 bps. Round-trip senaryolar c∈{0,10,20,50} bps.</w:t>
+        <w:t xml:space="preserve">V11'de işlem maliyeti ARTIK kanonikte simetrik (η≈10bps hem RL hem baseline; bkz. §8.9-C2). scripts/cost_sensitivity.py, kanonik üstü EK maliyet seviyelerine duyarlılığı ve düşük-turnover dayanıklılığını ölçer. Maliyet modeli (2024-2025 teyitli): aracı komisyonu binde 1-2 = 10-20 bps tek-yön (Garanti BBVA 31.05.2024; İKON Menkul 2025) + BSMV komisyon üzerine %5 + spread/slippage ~2-10 bps. Ek round-trip senaryolar c∈{0,10,20,50} bps.</w:t>
       </w:r>
     </w:p>
     <w:p>
@@ -15784,7 +15784,7 @@
                 <w:sz w:val="20"/>
                 <w:szCs w:val="20"/>
               </w:rPr>
-              <w:t xml:space="preserve">2.084</w:t>
+              <w:t xml:space="preserve">2.123</w:t>
             </w:r>
           </w:p>
         </w:tc>
@@ -15812,7 +15812,7 @@
                 <w:sz w:val="20"/>
                 <w:szCs w:val="20"/>
               </w:rPr>
-              <w:t xml:space="preserve">2.067</w:t>
+              <w:t xml:space="preserve">2.106</w:t>
             </w:r>
           </w:p>
         </w:tc>
@@ -15840,7 +15840,7 @@
                 <w:sz w:val="20"/>
                 <w:szCs w:val="20"/>
               </w:rPr>
-              <w:t xml:space="preserve">2.042</w:t>
+              <w:t xml:space="preserve">2.081</w:t>
             </w:r>
           </w:p>
         </w:tc>
@@ -15868,7 +15868,7 @@
                 <w:sz w:val="20"/>
                 <w:szCs w:val="20"/>
               </w:rPr>
-              <w:t xml:space="preserve">%1.35</w:t>
+              <w:t xml:space="preserve">~%1.3</w:t>
             </w:r>
           </w:p>
         </w:tc>
@@ -15957,7 +15957,7 @@
                 <w:sz w:val="20"/>
                 <w:szCs w:val="20"/>
               </w:rPr>
-              <w:t xml:space="preserve">2.200</w:t>
+              <w:t xml:space="preserve">2.195</w:t>
             </w:r>
           </w:p>
         </w:tc>
@@ -15986,7 +15986,7 @@
                 <w:sz w:val="20"/>
                 <w:szCs w:val="20"/>
               </w:rPr>
-              <w:t xml:space="preserve">2.189</w:t>
+              <w:t xml:space="preserve">2.184</w:t>
             </w:r>
           </w:p>
         </w:tc>
@@ -16015,7 +16015,7 @@
                 <w:sz w:val="20"/>
                 <w:szCs w:val="20"/>
               </w:rPr>
-              <w:t xml:space="preserve">2.173</w:t>
+              <w:t xml:space="preserve">2.167</w:t>
             </w:r>
           </w:p>
         </w:tc>
@@ -16044,7 +16044,7 @@
                 <w:sz w:val="20"/>
                 <w:szCs w:val="20"/>
               </w:rPr>
-              <w:t xml:space="preserve">~%0.5</w:t>
+              <w:t xml:space="preserve">~%1.0</w:t>
             </w:r>
           </w:p>
         </w:tc>
@@ -16102,7 +16102,7 @@
                 <w:sz w:val="20"/>
                 <w:szCs w:val="20"/>
               </w:rPr>
-              <w:t xml:space="preserve">0.029</w:t>
+              <w:t xml:space="preserve">0.015</w:t>
             </w:r>
           </w:p>
         </w:tc>
@@ -16130,7 +16130,7 @@
                 <w:sz w:val="20"/>
                 <w:szCs w:val="20"/>
               </w:rPr>
-              <w:t xml:space="preserve">1.966</w:t>
+              <w:t xml:space="preserve">2.129</w:t>
             </w:r>
           </w:p>
         </w:tc>
@@ -16158,7 +16158,7 @@
                 <w:sz w:val="20"/>
                 <w:szCs w:val="20"/>
               </w:rPr>
-              <w:t xml:space="preserve">1.919</w:t>
+              <w:t xml:space="preserve">2.104</w:t>
             </w:r>
           </w:p>
         </w:tc>
@@ -16186,7 +16186,7 @@
                 <w:sz w:val="20"/>
                 <w:szCs w:val="20"/>
               </w:rPr>
-              <w:t xml:space="preserve">1.848</w:t>
+              <w:t xml:space="preserve">2.067</w:t>
             </w:r>
           </w:p>
         </w:tc>
@@ -16214,7 +16214,7 @@
                 <w:sz w:val="20"/>
                 <w:szCs w:val="20"/>
               </w:rPr>
-              <w:t xml:space="preserve">~%3.7</w:t>
+              <w:t xml:space="preserve">~%1.9</w:t>
             </w:r>
           </w:p>
         </w:tc>
@@ -16303,7 +16303,7 @@
                 <w:sz w:val="20"/>
                 <w:szCs w:val="20"/>
               </w:rPr>
-              <w:t xml:space="preserve">1.973</w:t>
+              <w:t xml:space="preserve">1.952</w:t>
             </w:r>
           </w:p>
         </w:tc>
@@ -16332,7 +16332,7 @@
                 <w:sz w:val="20"/>
                 <w:szCs w:val="20"/>
               </w:rPr>
-              <w:t xml:space="preserve">1.932</w:t>
+              <w:t xml:space="preserve">1.911</w:t>
             </w:r>
           </w:p>
         </w:tc>
@@ -16361,7 +16361,7 @@
                 <w:sz w:val="20"/>
                 <w:szCs w:val="20"/>
               </w:rPr>
-              <w:t xml:space="preserve">1.869</w:t>
+              <w:t xml:space="preserve">1.848</w:t>
             </w:r>
           </w:p>
         </w:tc>
@@ -16476,7 +16476,7 @@
                 <w:sz w:val="20"/>
                 <w:szCs w:val="20"/>
               </w:rPr>
-              <w:t xml:space="preserve">1.659</w:t>
+              <w:t xml:space="preserve">1.629</w:t>
             </w:r>
           </w:p>
         </w:tc>
@@ -16504,7 +16504,7 @@
                 <w:sz w:val="20"/>
                 <w:szCs w:val="20"/>
               </w:rPr>
-              <w:t xml:space="preserve">1.598</w:t>
+              <w:t xml:space="preserve">1.568</w:t>
             </w:r>
           </w:p>
         </w:tc>
@@ -16532,7 +16532,7 @@
                 <w:sz w:val="20"/>
                 <w:szCs w:val="20"/>
               </w:rPr>
-              <w:t xml:space="preserve">1.506</w:t>
+              <w:t xml:space="preserve">1.475</w:t>
             </w:r>
           </w:p>
         </w:tc>
@@ -16560,7 +16560,7 @@
                 <w:sz w:val="20"/>
                 <w:szCs w:val="20"/>
               </w:rPr>
-              <w:t xml:space="preserve">~%5.9</w:t>
+              <w:t xml:space="preserve">~%5.8</w:t>
             </w:r>
           </w:p>
         </w:tc>
@@ -16620,7 +16620,7 @@
                 <w:sz w:val="20"/>
                 <w:szCs w:val="20"/>
               </w:rPr>
-              <w:t xml:space="preserve">0.139</w:t>
+              <w:t xml:space="preserve">0.049</w:t>
             </w:r>
           </w:p>
         </w:tc>
@@ -16649,7 +16649,7 @@
                 <w:sz w:val="20"/>
                 <w:szCs w:val="20"/>
               </w:rPr>
-              <w:t xml:space="preserve">1.679</w:t>
+              <w:t xml:space="preserve">1.994</w:t>
             </w:r>
           </w:p>
         </w:tc>
@@ -16678,7 +16678,7 @@
                 <w:sz w:val="20"/>
                 <w:szCs w:val="20"/>
               </w:rPr>
-              <w:t xml:space="preserve">1.461</w:t>
+              <w:t xml:space="preserve">1.916</w:t>
             </w:r>
           </w:p>
         </w:tc>
@@ -16707,7 +16707,7 @@
                 <w:sz w:val="20"/>
                 <w:szCs w:val="20"/>
               </w:rPr>
-              <w:t xml:space="preserve">1.135</w:t>
+              <w:t xml:space="preserve">1.799</w:t>
             </w:r>
           </w:p>
         </w:tc>
@@ -16736,7 +16736,7 @@
                 <w:sz w:val="20"/>
                 <w:szCs w:val="20"/>
               </w:rPr>
-              <w:t xml:space="preserve">~%17.5</w:t>
+              <w:t xml:space="preserve">~%6.2</w:t>
             </w:r>
           </w:p>
         </w:tc>
@@ -16794,7 +16794,7 @@
                 <w:sz w:val="20"/>
                 <w:szCs w:val="20"/>
               </w:rPr>
-              <w:t xml:space="preserve">0.237</w:t>
+              <w:t xml:space="preserve">0.235</w:t>
             </w:r>
           </w:p>
         </w:tc>
@@ -16822,7 +16822,7 @@
                 <w:sz w:val="20"/>
                 <w:szCs w:val="20"/>
               </w:rPr>
-              <w:t xml:space="preserve">0.417</w:t>
+              <w:t xml:space="preserve">0.470</w:t>
             </w:r>
           </w:p>
         </w:tc>
@@ -16850,7 +16850,7 @@
                 <w:sz w:val="20"/>
                 <w:szCs w:val="20"/>
               </w:rPr>
-              <w:t xml:space="preserve">0.060</w:t>
+              <w:t xml:space="preserve">0.181</w:t>
             </w:r>
           </w:p>
         </w:tc>
@@ -16878,7 +16878,7 @@
                 <w:sz w:val="20"/>
                 <w:szCs w:val="20"/>
               </w:rPr>
-              <w:t xml:space="preserve">−0.456</w:t>
+              <w:t xml:space="preserve">−0.241</w:t>
             </w:r>
           </w:p>
         </w:tc>
@@ -16906,7 +16906,7 @@
                 <w:sz w:val="20"/>
                 <w:szCs w:val="20"/>
               </w:rPr>
-              <w:t xml:space="preserve">~%29.9</w:t>
+              <w:t xml:space="preserve">~%29.6</w:t>
             </w:r>
           </w:p>
         </w:tc>
@@ -17101,7 +17101,7 @@
         <w:t xml:space="preserve">Bulgu: </w:t>
       </w:r>
       <w:r>
-        <w:t xml:space="preserve">Gerçekçi maliyet altında SAC'ın düşük turnover'ı (0.011) belirgin NET avantaja dönüşür — SAC neredeyse maliyet-bağışık (50bps'te drag %1.35, Sharpe 2.08→2.04). Yüksek-turnover ajanlar çöker: DQN Sharpe 0.42→−0.46 (negatif!), PPO 1.68→1.14, Momentum 1.66→1.51. RL ailesinde SAC, öğrenilmiş düşük-turnover sayesinde gerçek BIST maliyeti altında tek savunulabilir aktif ajandır.</w:t>
+        <w:t xml:space="preserve">Ek maliyet altında SAC'ın düşük turnover'ı (0.011) dayanıklılık sağlar — neredeyse maliyet-bağışık (ek 50bps'te drag ~%1.3, Sharpe 2.12→2.08). Yüksek-turnover DQN çöker (Sharpe 0.47→−0.24 negatif!); Momentum (1.63→1.48) ve PPO (1.99→1.80) belirgin bozulur. SAC/TD3 (düşük turnover) ile MinVar/InvVol/RiskParity (≈maliyet-bağışık), maliyet-dayanıklı en üst gruptur.</w:t>
       </w:r>
     </w:p>
     <w:p>
@@ -17331,6 +17331,621 @@
     </w:p>
     <w:p>
       <w:pPr>
+        <w:spacing w:after="40"/>
+      </w:pPr>
+      <w:r>
+        <w:t xml:space="preserve"/>
+      </w:r>
+    </w:p>
+    <w:p>
+      <w:pPr>
+        <w:pStyle w:val="Heading2"/>
+      </w:pPr>
+      <w:r>
+        <w:t xml:space="preserve">8.10. Adil-Karşılaştırma Metodolojisi + Action Tasarımı (V11)</w:t>
+      </w:r>
+    </w:p>
+    <w:p>
+      <w:pPr>
+        <w:spacing w:after="140"/>
+        <w:jc w:val="both"/>
+      </w:pPr>
+      <w:r>
+        <w:t xml:space="preserve">V11 revizyonu, dış hakem kod-incelemesinin 8 metodolojik bulgusunu giderdi ve action uzayını opportunity-cost ile zenginleştirdi:</w:t>
+      </w:r>
+    </w:p>
+    <w:tbl>
+      <w:tblPr>
+        <w:tblW w:type="dxa" w:w="9360"/>
+        <w:tblBorders>
+          <w:top w:val="single" w:color="auto" w:sz="4"/>
+          <w:left w:val="single" w:color="auto" w:sz="4"/>
+          <w:bottom w:val="single" w:color="auto" w:sz="4"/>
+          <w:right w:val="single" w:color="auto" w:sz="4"/>
+          <w:insideH w:val="single" w:color="auto" w:sz="4"/>
+          <w:insideV w:val="single" w:color="auto" w:sz="4"/>
+        </w:tblBorders>
+      </w:tblPr>
+      <w:tblGrid>
+        <w:gridCol w:w="2400"/>
+        <w:gridCol w:w="6960"/>
+      </w:tblGrid>
+      <w:tr>
+        <w:trPr>
+          <w:tblHeader/>
+        </w:trPr>
+        <w:tc>
+          <w:tcPr>
+            <w:tcW w:type="dxa" w:w="2400"/>
+            <w:tcBorders>
+              <w:top w:val="single" w:color="BFBFBF" w:sz="1"/>
+              <w:left w:val="single" w:color="BFBFBF" w:sz="1"/>
+              <w:bottom w:val="single" w:color="BFBFBF" w:sz="1"/>
+              <w:right w:val="single" w:color="BFBFBF" w:sz="1"/>
+            </w:tcBorders>
+            <w:shd w:fill="DCE6F1" w:val="clear"/>
+            <w:tcMar>
+              <w:top w:type="dxa" w:w="60"/>
+              <w:left w:type="dxa" w:w="110"/>
+              <w:bottom w:type="dxa" w:w="60"/>
+              <w:right w:type="dxa" w:w="110"/>
+            </w:tcMar>
+          </w:tcPr>
+          <w:p>
+            <w:r>
+              <w:rPr>
+                <w:b/>
+                <w:bCs/>
+                <w:sz w:val="20"/>
+                <w:szCs w:val="20"/>
+              </w:rPr>
+              <w:t xml:space="preserve">Düzeltme</w:t>
+            </w:r>
+          </w:p>
+        </w:tc>
+        <w:tc>
+          <w:tcPr>
+            <w:tcW w:type="dxa" w:w="6960"/>
+            <w:tcBorders>
+              <w:top w:val="single" w:color="BFBFBF" w:sz="1"/>
+              <w:left w:val="single" w:color="BFBFBF" w:sz="1"/>
+              <w:bottom w:val="single" w:color="BFBFBF" w:sz="1"/>
+              <w:right w:val="single" w:color="BFBFBF" w:sz="1"/>
+            </w:tcBorders>
+            <w:shd w:fill="DCE6F1" w:val="clear"/>
+            <w:tcMar>
+              <w:top w:type="dxa" w:w="60"/>
+              <w:left w:type="dxa" w:w="110"/>
+              <w:bottom w:type="dxa" w:w="60"/>
+              <w:right w:type="dxa" w:w="110"/>
+            </w:tcMar>
+          </w:tcPr>
+          <w:p>
+            <w:r>
+              <w:rPr>
+                <w:b/>
+                <w:bCs/>
+                <w:sz w:val="20"/>
+                <w:szCs w:val="20"/>
+              </w:rPr>
+              <w:t xml:space="preserve">Ne yapıldı / etki</w:t>
+            </w:r>
+          </w:p>
+        </w:tc>
+      </w:tr>
+      <w:tr>
+        <w:tc>
+          <w:tcPr>
+            <w:tcW w:type="dxa" w:w="2400"/>
+            <w:tcBorders>
+              <w:top w:val="single" w:color="BFBFBF" w:sz="1"/>
+              <w:left w:val="single" w:color="BFBFBF" w:sz="1"/>
+              <w:bottom w:val="single" w:color="BFBFBF" w:sz="1"/>
+              <w:right w:val="single" w:color="BFBFBF" w:sz="1"/>
+            </w:tcBorders>
+            <w:tcMar>
+              <w:top w:type="dxa" w:w="60"/>
+              <w:left w:type="dxa" w:w="110"/>
+              <w:bottom w:type="dxa" w:w="60"/>
+              <w:right w:type="dxa" w:w="110"/>
+            </w:tcMar>
+          </w:tcPr>
+          <w:p>
+            <w:r>
+              <w:rPr>
+                <w:b w:val="false"/>
+                <w:bCs w:val="false"/>
+                <w:sz w:val="20"/>
+                <w:szCs w:val="20"/>
+              </w:rPr>
+              <w:t xml:space="preserve">C1 Metrik hizalama</w:t>
+            </w:r>
+          </w:p>
+        </w:tc>
+        <w:tc>
+          <w:tcPr>
+            <w:tcW w:type="dxa" w:w="6960"/>
+            <w:tcBorders>
+              <w:top w:val="single" w:color="BFBFBF" w:sz="1"/>
+              <w:left w:val="single" w:color="BFBFBF" w:sz="1"/>
+              <w:bottom w:val="single" w:color="BFBFBF" w:sz="1"/>
+              <w:right w:val="single" w:color="BFBFBF" w:sz="1"/>
+            </w:tcBorders>
+            <w:tcMar>
+              <w:top w:type="dxa" w:w="60"/>
+              <w:left w:type="dxa" w:w="110"/>
+              <w:bottom w:type="dxa" w:w="60"/>
+              <w:right w:type="dxa" w:w="110"/>
+            </w:tcMar>
+          </w:tcPr>
+          <w:p>
+            <w:r>
+              <w:rPr>
+                <w:b w:val="false"/>
+                <w:bCs w:val="false"/>
+                <w:sz w:val="20"/>
+                <w:szCs w:val="20"/>
+              </w:rPr>
+              <w:t xml:space="preserve">RL ile baseline AYNI takvim penceresinde + NAV[0]=1 yeniden-tabanlama → FinalNAV/CAGR adil pencere büyümesi (önce RL t=window'dan, baseline 0'dan başlıyordu)</w:t>
+            </w:r>
+          </w:p>
+        </w:tc>
+      </w:tr>
+      <w:tr>
+        <w:tc>
+          <w:tcPr>
+            <w:tcW w:type="dxa" w:w="2400"/>
+            <w:tcBorders>
+              <w:top w:val="single" w:color="BFBFBF" w:sz="1"/>
+              <w:left w:val="single" w:color="BFBFBF" w:sz="1"/>
+              <w:bottom w:val="single" w:color="BFBFBF" w:sz="1"/>
+              <w:right w:val="single" w:color="BFBFBF" w:sz="1"/>
+            </w:tcBorders>
+            <w:shd w:fill="F3F6FB" w:val="clear"/>
+            <w:tcMar>
+              <w:top w:type="dxa" w:w="60"/>
+              <w:left w:type="dxa" w:w="110"/>
+              <w:bottom w:type="dxa" w:w="60"/>
+              <w:right w:type="dxa" w:w="110"/>
+            </w:tcMar>
+          </w:tcPr>
+          <w:p>
+            <w:r>
+              <w:rPr>
+                <w:b w:val="false"/>
+                <w:bCs w:val="false"/>
+                <w:sz w:val="20"/>
+                <w:szCs w:val="20"/>
+              </w:rPr>
+              <w:t xml:space="preserve">C2 Maliyetli baseline</w:t>
+            </w:r>
+          </w:p>
+        </w:tc>
+        <w:tc>
+          <w:tcPr>
+            <w:tcW w:type="dxa" w:w="6960"/>
+            <w:tcBorders>
+              <w:top w:val="single" w:color="BFBFBF" w:sz="1"/>
+              <w:left w:val="single" w:color="BFBFBF" w:sz="1"/>
+              <w:bottom w:val="single" w:color="BFBFBF" w:sz="1"/>
+              <w:right w:val="single" w:color="BFBFBF" w:sz="1"/>
+            </w:tcBorders>
+            <w:shd w:fill="F3F6FB" w:val="clear"/>
+            <w:tcMar>
+              <w:top w:type="dxa" w:w="60"/>
+              <w:left w:type="dxa" w:w="110"/>
+              <w:bottom w:type="dxa" w:w="60"/>
+              <w:right w:type="dxa" w:w="110"/>
+            </w:tcMar>
+          </w:tcPr>
+          <w:p>
+            <w:r>
+              <w:rPr>
+                <w:b w:val="false"/>
+                <w:bCs w:val="false"/>
+                <w:sz w:val="20"/>
+                <w:szCs w:val="20"/>
+              </w:rPr>
+              <w:t xml:space="preserve">Tüm rebalans baseline'ları RL ile simetrik η≈10bps işlem maliyeti öder (önce maliyetsizdi → baseline'lara haksız avantaj)</w:t>
+            </w:r>
+          </w:p>
+        </w:tc>
+      </w:tr>
+      <w:tr>
+        <w:tc>
+          <w:tcPr>
+            <w:tcW w:type="dxa" w:w="2400"/>
+            <w:tcBorders>
+              <w:top w:val="single" w:color="BFBFBF" w:sz="1"/>
+              <w:left w:val="single" w:color="BFBFBF" w:sz="1"/>
+              <w:bottom w:val="single" w:color="BFBFBF" w:sz="1"/>
+              <w:right w:val="single" w:color="BFBFBF" w:sz="1"/>
+            </w:tcBorders>
+            <w:tcMar>
+              <w:top w:type="dxa" w:w="60"/>
+              <w:left w:type="dxa" w:w="110"/>
+              <w:bottom w:type="dxa" w:w="60"/>
+              <w:right w:type="dxa" w:w="110"/>
+            </w:tcMar>
+          </w:tcPr>
+          <w:p>
+            <w:r>
+              <w:rPr>
+                <w:b w:val="false"/>
+                <w:bCs w:val="false"/>
+                <w:sz w:val="20"/>
+                <w:szCs w:val="20"/>
+              </w:rPr>
+              <w:t xml:space="preserve">C3 Başarı metriği</w:t>
+            </w:r>
+          </w:p>
+        </w:tc>
+        <w:tc>
+          <w:tcPr>
+            <w:tcW w:type="dxa" w:w="6960"/>
+            <w:tcBorders>
+              <w:top w:val="single" w:color="BFBFBF" w:sz="1"/>
+              <w:left w:val="single" w:color="BFBFBF" w:sz="1"/>
+              <w:bottom w:val="single" w:color="BFBFBF" w:sz="1"/>
+              <w:right w:val="single" w:color="BFBFBF" w:sz="1"/>
+            </w:tcBorders>
+            <w:tcMar>
+              <w:top w:type="dxa" w:w="60"/>
+              <w:left w:type="dxa" w:w="110"/>
+              <w:bottom w:type="dxa" w:w="60"/>
+              <w:right w:type="dxa" w:w="110"/>
+            </w:tcMar>
+          </w:tcPr>
+          <w:p>
+            <w:r>
+              <w:rPr>
+                <w:b w:val="false"/>
+                <w:bCs w:val="false"/>
+                <w:sz w:val="20"/>
+                <w:szCs w:val="20"/>
+              </w:rPr>
+              <w:t xml:space="preserve">Eğitim başarısı = eşit-ağırlık benchmark'ı geçme (success_vs_benchmark); CLI'daki nav&gt;1 override kaldırıldı</w:t>
+            </w:r>
+          </w:p>
+        </w:tc>
+      </w:tr>
+      <w:tr>
+        <w:tc>
+          <w:tcPr>
+            <w:tcW w:type="dxa" w:w="2400"/>
+            <w:tcBorders>
+              <w:top w:val="single" w:color="BFBFBF" w:sz="1"/>
+              <w:left w:val="single" w:color="BFBFBF" w:sz="1"/>
+              <w:bottom w:val="single" w:color="BFBFBF" w:sz="1"/>
+              <w:right w:val="single" w:color="BFBFBF" w:sz="1"/>
+            </w:tcBorders>
+            <w:shd w:fill="F3F6FB" w:val="clear"/>
+            <w:tcMar>
+              <w:top w:type="dxa" w:w="60"/>
+              <w:left w:type="dxa" w:w="110"/>
+              <w:bottom w:type="dxa" w:w="60"/>
+              <w:right w:type="dxa" w:w="110"/>
+            </w:tcMar>
+          </w:tcPr>
+          <w:p>
+            <w:r>
+              <w:rPr>
+                <w:b w:val="false"/>
+                <w:bCs w:val="false"/>
+                <w:sz w:val="20"/>
+                <w:szCs w:val="20"/>
+              </w:rPr>
+              <w:t xml:space="preserve">C4 PPO eval</w:t>
+            </w:r>
+          </w:p>
+        </w:tc>
+        <w:tc>
+          <w:tcPr>
+            <w:tcW w:type="dxa" w:w="6960"/>
+            <w:tcBorders>
+              <w:top w:val="single" w:color="BFBFBF" w:sz="1"/>
+              <w:left w:val="single" w:color="BFBFBF" w:sz="1"/>
+              <w:bottom w:val="single" w:color="BFBFBF" w:sz="1"/>
+              <w:right w:val="single" w:color="BFBFBF" w:sz="1"/>
+            </w:tcBorders>
+            <w:shd w:fill="F3F6FB" w:val="clear"/>
+            <w:tcMar>
+              <w:top w:type="dxa" w:w="60"/>
+              <w:left w:type="dxa" w:w="110"/>
+              <w:bottom w:type="dxa" w:w="60"/>
+              <w:right w:type="dxa" w:w="110"/>
+            </w:tcMar>
+          </w:tcPr>
+          <w:p>
+            <w:r>
+              <w:rPr>
+                <w:b w:val="false"/>
+                <w:bCs w:val="false"/>
+                <w:sz w:val="20"/>
+                <w:szCs w:val="20"/>
+              </w:rPr>
+              <w:t xml:space="preserve">PPO değerlendirme deterministik (politika ortalaması μ); SAC/TD3/DQN ile tutarlı tek-deterministik backtest</w:t>
+            </w:r>
+          </w:p>
+        </w:tc>
+      </w:tr>
+      <w:tr>
+        <w:tc>
+          <w:tcPr>
+            <w:tcW w:type="dxa" w:w="2400"/>
+            <w:tcBorders>
+              <w:top w:val="single" w:color="BFBFBF" w:sz="1"/>
+              <w:left w:val="single" w:color="BFBFBF" w:sz="1"/>
+              <w:bottom w:val="single" w:color="BFBFBF" w:sz="1"/>
+              <w:right w:val="single" w:color="BFBFBF" w:sz="1"/>
+            </w:tcBorders>
+            <w:tcMar>
+              <w:top w:type="dxa" w:w="60"/>
+              <w:left w:type="dxa" w:w="110"/>
+              <w:bottom w:type="dxa" w:w="60"/>
+              <w:right w:type="dxa" w:w="110"/>
+            </w:tcMar>
+          </w:tcPr>
+          <w:p>
+            <w:r>
+              <w:rPr>
+                <w:b w:val="false"/>
+                <w:bCs w:val="false"/>
+                <w:sz w:val="20"/>
+                <w:szCs w:val="20"/>
+              </w:rPr>
+              <w:t xml:space="preserve">C5 Sentetik koruma</w:t>
+            </w:r>
+          </w:p>
+        </w:tc>
+        <w:tc>
+          <w:tcPr>
+            <w:tcW w:type="dxa" w:w="6960"/>
+            <w:tcBorders>
+              <w:top w:val="single" w:color="BFBFBF" w:sz="1"/>
+              <w:left w:val="single" w:color="BFBFBF" w:sz="1"/>
+              <w:bottom w:val="single" w:color="BFBFBF" w:sz="1"/>
+              <w:right w:val="single" w:color="BFBFBF" w:sz="1"/>
+            </w:tcBorders>
+            <w:tcMar>
+              <w:top w:type="dxa" w:w="60"/>
+              <w:left w:type="dxa" w:w="110"/>
+              <w:bottom w:type="dxa" w:w="60"/>
+              <w:right w:type="dxa" w:w="110"/>
+            </w:tcMar>
+          </w:tcPr>
+          <w:p>
+            <w:r>
+              <w:rPr>
+                <w:b w:val="false"/>
+                <w:bCs w:val="false"/>
+                <w:sz w:val="20"/>
+                <w:szCs w:val="20"/>
+              </w:rPr>
+              <w:t xml:space="preserve">main.py --allow-synthetic bayrağı olmadan sentetik veriyle sonuç üretmez (akademik bütünlük)</w:t>
+            </w:r>
+          </w:p>
+        </w:tc>
+      </w:tr>
+      <w:tr>
+        <w:tc>
+          <w:tcPr>
+            <w:tcW w:type="dxa" w:w="2400"/>
+            <w:tcBorders>
+              <w:top w:val="single" w:color="BFBFBF" w:sz="1"/>
+              <w:left w:val="single" w:color="BFBFBF" w:sz="1"/>
+              <w:bottom w:val="single" w:color="BFBFBF" w:sz="1"/>
+              <w:right w:val="single" w:color="BFBFBF" w:sz="1"/>
+            </w:tcBorders>
+            <w:shd w:fill="F3F6FB" w:val="clear"/>
+            <w:tcMar>
+              <w:top w:type="dxa" w:w="60"/>
+              <w:left w:type="dxa" w:w="110"/>
+              <w:bottom w:type="dxa" w:w="60"/>
+              <w:right w:type="dxa" w:w="110"/>
+            </w:tcMar>
+          </w:tcPr>
+          <w:p>
+            <w:r>
+              <w:rPr>
+                <w:b w:val="false"/>
+                <w:bCs w:val="false"/>
+                <w:sz w:val="20"/>
+                <w:szCs w:val="20"/>
+              </w:rPr>
+              <w:t xml:space="preserve">C6 Walk-forward</w:t>
+            </w:r>
+          </w:p>
+        </w:tc>
+        <w:tc>
+          <w:tcPr>
+            <w:tcW w:type="dxa" w:w="6960"/>
+            <w:tcBorders>
+              <w:top w:val="single" w:color="BFBFBF" w:sz="1"/>
+              <w:left w:val="single" w:color="BFBFBF" w:sz="1"/>
+              <w:bottom w:val="single" w:color="BFBFBF" w:sz="1"/>
+              <w:right w:val="single" w:color="BFBFBF" w:sz="1"/>
+            </w:tcBorders>
+            <w:shd w:fill="F3F6FB" w:val="clear"/>
+            <w:tcMar>
+              <w:top w:type="dxa" w:w="60"/>
+              <w:left w:type="dxa" w:w="110"/>
+              <w:bottom w:type="dxa" w:w="60"/>
+              <w:right w:type="dxa" w:w="110"/>
+            </w:tcMar>
+          </w:tcPr>
+          <w:p>
+            <w:r>
+              <w:rPr>
+                <w:b w:val="false"/>
+                <w:bCs w:val="false"/>
+                <w:sz w:val="20"/>
+                <w:szCs w:val="20"/>
+              </w:rPr>
+              <w:t xml:space="preserve">Walk-forward env'ine makro/regime eklendi → final ortamı doğrular (önce sade teknik-feature ortamı)</w:t>
+            </w:r>
+          </w:p>
+        </w:tc>
+      </w:tr>
+      <w:tr>
+        <w:tc>
+          <w:tcPr>
+            <w:tcW w:type="dxa" w:w="2400"/>
+            <w:tcBorders>
+              <w:top w:val="single" w:color="BFBFBF" w:sz="1"/>
+              <w:left w:val="single" w:color="BFBFBF" w:sz="1"/>
+              <w:bottom w:val="single" w:color="BFBFBF" w:sz="1"/>
+              <w:right w:val="single" w:color="BFBFBF" w:sz="1"/>
+            </w:tcBorders>
+            <w:tcMar>
+              <w:top w:type="dxa" w:w="60"/>
+              <w:left w:type="dxa" w:w="110"/>
+              <w:bottom w:type="dxa" w:w="60"/>
+              <w:right w:type="dxa" w:w="110"/>
+            </w:tcMar>
+          </w:tcPr>
+          <w:p>
+            <w:r>
+              <w:rPr>
+                <w:b w:val="false"/>
+                <w:bCs w:val="false"/>
+                <w:sz w:val="20"/>
+                <w:szCs w:val="20"/>
+              </w:rPr>
+              <w:t xml:space="preserve">C7 Reward log-net</w:t>
+            </w:r>
+          </w:p>
+        </w:tc>
+        <w:tc>
+          <w:tcPr>
+            <w:tcW w:type="dxa" w:w="6960"/>
+            <w:tcBorders>
+              <w:top w:val="single" w:color="BFBFBF" w:sz="1"/>
+              <w:left w:val="single" w:color="BFBFBF" w:sz="1"/>
+              <w:bottom w:val="single" w:color="BFBFBF" w:sz="1"/>
+              <w:right w:val="single" w:color="BFBFBF" w:sz="1"/>
+            </w:tcBorders>
+            <w:tcMar>
+              <w:top w:type="dxa" w:w="60"/>
+              <w:left w:type="dxa" w:w="110"/>
+              <w:bottom w:type="dxa" w:w="60"/>
+              <w:right w:type="dxa" w:w="110"/>
+            </w:tcMar>
+          </w:tcPr>
+          <w:p>
+            <w:r>
+              <w:rPr>
+                <w:b w:val="false"/>
+                <w:bCs w:val="false"/>
+                <w:sz w:val="20"/>
+                <w:szCs w:val="20"/>
+              </w:rPr>
+              <w:t xml:space="preserve">Ödül log(1+net) (işlem maliyeti çift-sayımı giderildi); NAV ile tutarlı geometrik fayda</w:t>
+            </w:r>
+          </w:p>
+        </w:tc>
+      </w:tr>
+      <w:tr>
+        <w:tc>
+          <w:tcPr>
+            <w:tcW w:type="dxa" w:w="2400"/>
+            <w:tcBorders>
+              <w:top w:val="single" w:color="BFBFBF" w:sz="1"/>
+              <w:left w:val="single" w:color="BFBFBF" w:sz="1"/>
+              <w:bottom w:val="single" w:color="BFBFBF" w:sz="1"/>
+              <w:right w:val="single" w:color="BFBFBF" w:sz="1"/>
+            </w:tcBorders>
+            <w:shd w:fill="F3F6FB" w:val="clear"/>
+            <w:tcMar>
+              <w:top w:type="dxa" w:w="60"/>
+              <w:left w:type="dxa" w:w="110"/>
+              <w:bottom w:type="dxa" w:w="60"/>
+              <w:right w:type="dxa" w:w="110"/>
+            </w:tcMar>
+          </w:tcPr>
+          <w:p>
+            <w:r>
+              <w:rPr>
+                <w:b w:val="false"/>
+                <w:bCs w:val="false"/>
+                <w:sz w:val="20"/>
+                <w:szCs w:val="20"/>
+              </w:rPr>
+              <w:t xml:space="preserve">C8 Sunum</w:t>
+            </w:r>
+          </w:p>
+        </w:tc>
+        <w:tc>
+          <w:tcPr>
+            <w:tcW w:type="dxa" w:w="6960"/>
+            <w:tcBorders>
+              <w:top w:val="single" w:color="BFBFBF" w:sz="1"/>
+              <w:left w:val="single" w:color="BFBFBF" w:sz="1"/>
+              <w:bottom w:val="single" w:color="BFBFBF" w:sz="1"/>
+              <w:right w:val="single" w:color="BFBFBF" w:sz="1"/>
+            </w:tcBorders>
+            <w:shd w:fill="F3F6FB" w:val="clear"/>
+            <w:tcMar>
+              <w:top w:type="dxa" w:w="60"/>
+              <w:left w:type="dxa" w:w="110"/>
+              <w:bottom w:type="dxa" w:w="60"/>
+              <w:right w:type="dxa" w:w="110"/>
+            </w:tcMar>
+          </w:tcPr>
+          <w:p>
+            <w:r>
+              <w:rPr>
+                <w:b w:val="false"/>
+                <w:bCs w:val="false"/>
+                <w:sz w:val="20"/>
+                <w:szCs w:val="20"/>
+              </w:rPr>
+              <w:t xml:space="preserve">Arayüz başlığı DQN/PPO/SAC/TD3 (TD3 eklendi)</w:t>
+            </w:r>
+          </w:p>
+        </w:tc>
+      </w:tr>
+    </w:tbl>
+    <w:p>
+      <w:pPr>
+        <w:spacing w:after="140"/>
+        <w:jc w:val="both"/>
+      </w:pPr>
+      <w:r>
+        <w:rPr>
+          <w:i/>
+          <w:iCs/>
+          <w:color w:val="555555"/>
+        </w:rPr>
+        <w:t xml:space="preserve">Kilit gözlem: bu düzeltmeler RL'i GÜÇLENDİRDİ — önceki asimetrik ceza (RL maliyet öder/baseline ödemez; RL nakiti %0 kazanır) kaldırıldığında SAC/TD3 risk-bazlı optimize edicilerle başa baş çıktı (§8.1).</w:t>
+      </w:r>
+    </w:p>
+    <w:p>
+      <w:pPr>
+        <w:spacing w:after="40"/>
+      </w:pPr>
+      <w:r>
+        <w:t xml:space="preserve"/>
+      </w:r>
+    </w:p>
+    <w:p>
+      <w:pPr>
+        <w:spacing w:after="140"/>
+        <w:jc w:val="both"/>
+      </w:pPr>
+      <w:r>
+        <w:rPr>
+          <w:b/>
+          <w:bCs/>
+        </w:rPr>
+        <w:t xml:space="preserve">Action tasarımı + nakit faizi (opportunity cost): </w:t>
+      </w:r>
+      <w:r>
+        <w:t xml:space="preserve">Ajan her gün portföy ağırlığı + al/sat + nakit tutma kararı verir. Nakit varlık GERÇEK risksiz faiz kazanır (cash_annual_rate=0.40 parametrik; günlük (1+r)^(1/252)−1 ≈ 0.00134). Böylece ajan "hisse mi nakit mi daha kârlı?" fırsat-maliyetini içselleştirir — nakitte durmak artık bedava-ama-sıfır değil, ~%40/yıl getiri sağlar; bir hisse ancak bunu aşarsa tercih edilir. CashRiskFree baseline (NAV 2.506) bu risksiz hurdle'ı temsil eder: bir strateji bunu risk-ayarlıda geçemiyorsa piyasa riskini almak boşunadır. Altın/dolar MAKRO-FEATURE'dır (state'te rejim sinyali), portföyde alınabilir varlık değildir (bilinçli kapsam kararı). Sharpe NOMİNAL'dir (rf=0); risksiz hurdle CashRiskFree NAV'ında ayrıca raporlanır.</w:t>
+      </w:r>
+    </w:p>
+    <w:p>
+      <w:pPr>
         <w:pStyle w:val="Heading1"/>
       </w:pPr>
       <w:r>
@@ -18151,10 +18766,10 @@
           <w:b/>
           <w:bCs/>
         </w:rPr>
-        <w:t xml:space="preserve">Ajan nerede başarısız kaldı? </w:t>
-      </w:r>
-      <w:r>
-        <w:t xml:space="preserve">Somut bulgular (reprodüklenebilir kanonik, results/metrics.csv): (1) DQN kârlı ama zayıf (FinalNAV 1.28, Sharpe 0.44) ve patolojik kararsızdır — 5-seed varyasyon katsayısı ~%47 (§8.5), tek-seed güvenilmez. (2) Hiçbir RL ajanı mutlak NAV'da pasif baseline'ı geçemedi (en iyi RL SAC 5.50 vs BuyHold 6.71). (3) Dahası, klasik risk-bazlı optimize ediciler RL'i RİSK-AYARLIDA da geçer (MinVariance Sharpe 2.30 / NAV 7.84 vs SAC 2.10). SAC/TD3 yalnız naif 1/N (2.08) düzeyine ulaşır; en somut katkıları çok düşük turnover (SAC 0.011). Ani rejim kırılmalarında tepki gecikmeli; PPO forecast'tan faydalanamadı.</w:t>
+        <w:t xml:space="preserve">Ajan nerede başarısız / nerede başarılı (adil V11)? </w:t>
+      </w:r>
+      <w:r>
+        <w:t xml:space="preserve">Somut bulgular (adil kanonik, results/metrics.csv): (1) DQN patolojik kararsız (5-seed CV ~%45, §8.5); tek-seed güvenilmez. (2) Adalet düzeltmeleri sonrası RL GÜÇLENDİ: en iyi RL TD3 2.151 / SAC 2.141 Sharpe → InverseVol (2.162) / RiskParity (2.135) düzeyinde; naif 1/N'i (2.090) ve risksiz faiz hurdle'ını (CashRiskFree NAV 2.506) GEÇER. (3) Ama MinVariance (2.317) hâlâ önde ve RL mutlak NAV'da hafif geride (SAC 5.595 vs BuyHold 5.751). SAC'ın somut katkısı en düşük turnover (0.011) → maliyet altında dayanıklılık. Ani rejim kırılmalarında tepki gecikmeli; PPO forecast'tan faydalanamadı (forecast öngörü gücü yok, §8.7).</w:t>
       </w:r>
     </w:p>
     <w:p>
@@ -18234,7 +18849,7 @@
         <w:t xml:space="preserve">Problem daha karmaşık olsaydı ne eklenirdi? </w:t>
       </w:r>
       <w:r>
-        <w:t xml:space="preserve">Bu projede zaten eklenenler: makro rejim (V6), rejim-amplified CVaR (V7), TD3, fiyat gürültüsü (V8) ve titizlik katmanı (DSR/PBO/MC/reel-NAV). Bundan sonrası: çok-varlık-sınıfı evren, nakit faiz geliri + BSMV'yi ödüle katma, reel-NAV'ı doğrudan ödüle katma.</w:t>
+        <w:t xml:space="preserve">Bu projede zaten eklenenler: makro rejim (V6), rejim-amplified CVaR (V7), fiyat gürültüsü (V8), nakit risksiz faizi + adil-karşılaştırma metodolojisi (V11) ve titizlik katmanı (DSR/PBO/MC/reel-NAV). Bundan sonrası: altın/dolar tradeable evren, BSMV/komisyonun ödüle doğrudan katılması, reel-NAV'ı doğrudan ödüle katma, excess-return (rf-düşülmüş) Sharpe.</w:t>
       </w:r>
     </w:p>
     <w:p>
@@ -18362,7 +18977,7 @@
           <w:sz w:val="18"/>
           <w:szCs w:val="18"/>
         </w:rPr>
-        <w:t xml:space="preserve">pytest -q                       # 159 test (reproduklenebilir golden-master dahil)</w:t>
+        <w:t xml:space="preserve">pytest -q                       # 191 test (reproduklenebilir golden V11 dahil)</w:t>
       </w:r>
     </w:p>
     <w:p>

</xml_diff>